<commit_message>
docs: informe Word refleja el estado real de cumplimiento (notas por requisito y Apéndice E)
Co-Authored-By: Claude Opus 5.5 <noreply@anthropic.com>
</commit_message>
<xml_diff>
--- a/docs/informe/Percepción v4 B.docx
+++ b/docs/informe/Percepción v4 B.docx
@@ -2030,14 +2030,14 @@
           <w:color w:val="1f1f1f"/>
           <w:rtl w:val="0"/>
         </w:rPr>
-        <w:t xml:space="preserve">Tipo de Producto:</w:t>
-      </w:r>
-      <w:r>
-        <w:rPr>
-          <w:color w:val="1f1f1f"/>
-          <w:rtl w:val="0"/>
-        </w:rPr>
-        <w:t xml:space="preserve"> Aplicación independiente (</w:t>
+        <w:t>Tipo de Producto:</w:t>
+      </w:r>
+      <w:r>
+        <w:rPr>
+          <w:color w:val="1f1f1f"/>
+          <w:rtl w:val="0"/>
+        </w:rPr>
+        <w:t xml:space="preserve"> Aplicación web local independiente (</w:t>
       </w:r>
       <w:r>
         <w:rPr>
@@ -2046,14 +2046,14 @@
           <w:color w:val="1f1f1f"/>
           <w:rtl w:val="0"/>
         </w:rPr>
-        <w:t xml:space="preserve">standalone</w:t>
-      </w:r>
-      <w:r>
-        <w:rPr>
-          <w:color w:val="1f1f1f"/>
-          <w:rtl w:val="0"/>
-        </w:rPr>
-        <w:t xml:space="preserve">) para procesamiento e inspección visual en tiempo real con aceleración por hardware (GPU NVIDIA CUDA 12.8, con fallback a CPU modo headless).</w:t>
+        <w:t>standalone</w:t>
+      </w:r>
+      <w:r>
+        <w:rPr>
+          <w:color w:val="1f1f1f"/>
+          <w:rtl w:val="0"/>
+        </w:rPr>
+        <w:t>): un servidor Python (Flask) ejecuta el motor de visión y sirve el panel de supervisión en el navegador. Aceleración por GPU NVIDIA (CUDA 12.8) con alternativa en CPU (más lenta y sin mejora de video).</w:t>
       </w:r>
       <w:r>
         <w:rPr>
@@ -2293,14 +2293,14 @@
           <w:color w:val="1f1f1f"/>
           <w:rtl w:val="0"/>
         </w:rPr>
-        <w:t xml:space="preserve">Filtrado de certeza:</w:t>
-      </w:r>
-      <w:r>
-        <w:rPr>
-          <w:color w:val="1f1f1f"/>
-          <w:rtl w:val="0"/>
-        </w:rPr>
-        <w:t xml:space="preserve"> Aplicación de umbrales de confianza configurables (75% pre-filtrado / 85% confirmación) para eliminar falsos positivos (</w:t>
+        <w:t>Filtrado de certeza:</w:t>
+      </w:r>
+      <w:r>
+        <w:rPr>
+          <w:color w:val="1f1f1f"/>
+          <w:rtl w:val="0"/>
+        </w:rPr>
+        <w:t xml:space="preserve"> Umbrales de confianza configurables (75% pre-filtrado / 85% confirmación). En la implementación la puerta de disparo de alertas es 0.35, porque con 0.75 el detector no emitía ninguna alerta (ver nota de </w:t>
       </w:r>
       <w:r>
         <w:rPr>
@@ -2309,14 +2309,14 @@
           <w:color w:val="1f1f1f"/>
           <w:rtl w:val="0"/>
         </w:rPr>
-        <w:t xml:space="preserve">RQF04</w:t>
-      </w:r>
-      <w:r>
-        <w:rPr>
-          <w:color w:val="1f1f1f"/>
-          <w:rtl w:val="0"/>
-        </w:rPr>
-        <w:t xml:space="preserve">).</w:t>
+        <w:t>RQF04</w:t>
+      </w:r>
+      <w:r>
+        <w:rPr>
+          <w:color w:val="1f1f1f"/>
+          <w:rtl w:val="0"/>
+        </w:rPr>
+        <w:t>).</w:t>
       </w:r>
       <w:r>
         <w:rPr>
@@ -2351,7 +2351,7 @@
           <w:color w:val="1f1f1f"/>
           <w:rtl w:val="0"/>
         </w:rPr>
-        <w:t xml:space="preserve"> Rastreo de identidades únicas (ID de seguimiento) mediante un algoritmo de seguimiento IoU propio (~30 líneas), tolerando oclusiones de hasta 1 segundo (</w:t>
+        <w:t xml:space="preserve"> Rastreo de identidades únicas (ID de seguimiento) mediante un algoritmo de seguimiento IoU propio, tolerando oclusiones de hasta 1 segundo (</w:t>
       </w:r>
       <w:r>
         <w:rPr>
@@ -2530,6 +2530,55 @@
     </w:p>
     <w:p>
       <w:pPr>
+        <w:numPr>
+          <w:ilvl w:val="0"/>
+          <w:numId w:val="2"/>
+        </w:numPr>
+        <w:spacing w:after="220" w:line="276" w:lineRule="auto"/>
+        <w:ind w:left="720" w:hanging="360"/>
+        <w:rPr>
+          <w:rFonts w:ascii="Roboto" w:cs="Roboto" w:eastAsia="Roboto" w:hAnsi="Roboto"/>
+          <w:color w:val="1f1f1f"/>
+        </w:rPr>
+      </w:pPr>
+      <w:r>
+        <w:rPr>
+          <w:b/>
+          <w:bCs w:val="1"/>
+          <w:color w:val="1f1f1f"/>
+          <w:rtl w:val="0"/>
+        </w:rPr>
+        <w:t>Mejora de calidad de video en vivo:</w:t>
+      </w:r>
+      <w:r>
+        <w:rPr>
+          <w:color w:val="1f1f1f"/>
+          <w:rtl w:val="0"/>
+        </w:rPr>
+        <w:t xml:space="preserve"> opción en el panel para ver la cámara en vivo mejorada con Real-ESRGAN x4 (realesr-general-x4v3), de forma fluida (~29 FPS en GPU). La detección siempre se hace sobre el fotograma original.</w:t>
+      </w:r>
+      <w:r>
+        <w:rPr>
+          <w:b w:val="1"/>
+          <w:bCs w:val="1"/>
+          <w:color w:val="1f1f1f"/>
+          <w:rtl w:val="0"/>
+        </w:rPr>
+      </w:r>
+      <w:r>
+        <w:rPr>
+          <w:color w:val="1f1f1f"/>
+          <w:rtl w:val="0"/>
+        </w:rPr>
+      </w:r>
+      <w:r>
+        <w:rPr>
+          <w:rtl w:val="0"/>
+        </w:rPr>
+      </w:r>
+    </w:p>
+    <w:p>
+      <w:pPr>
         <w:pStyle w:val="Heading4"/>
         <w:keepNext w:val="0"/>
         <w:keepLines w:val="0"/>
@@ -2725,14 +2774,14 @@
           <w:color w:val="1f1f1f"/>
           <w:rtl w:val="0"/>
         </w:rPr>
-        <w:t xml:space="preserve">Sin interoperabilidad externa:</w:t>
-      </w:r>
-      <w:r>
-        <w:rPr>
-          <w:color w:val="1f1f1f"/>
-          <w:rtl w:val="0"/>
-        </w:rPr>
-        <w:t xml:space="preserve"> En esta versión (V1), el software es una solución aislada que </w:t>
+        <w:t>Sin interoperabilidad externa:</w:t>
+      </w:r>
+      <w:r>
+        <w:rPr>
+          <w:color w:val="1f1f1f"/>
+          <w:rtl w:val="0"/>
+        </w:rPr>
+        <w:t xml:space="preserve"> En esta versión el software es una solución aislada que </w:t>
       </w:r>
       <w:r>
         <w:rPr>
@@ -2741,14 +2790,14 @@
           <w:color w:val="1f1f1f"/>
           <w:rtl w:val="0"/>
         </w:rPr>
-        <w:t xml:space="preserve">no intercambiará datos ni se integrará con sistemas de videovigilancia globales de terceros (VMS/NVR), plataformas de control de accesos ni bases de datos institucionales</w:t>
-      </w:r>
-      <w:r>
-        <w:rPr>
-          <w:color w:val="1f1f1f"/>
-          <w:rtl w:val="0"/>
-        </w:rPr>
-        <w:t xml:space="preserve"> de la UPAO.</w:t>
+        <w:t>no intercambiará datos ni se integrará con sistemas de videovigilancia globales de terceros (VMS/NVR), plataformas de control de accesos ni bases de datos institucionales</w:t>
+      </w:r>
+      <w:r>
+        <w:rPr>
+          <w:color w:val="1f1f1f"/>
+          <w:rtl w:val="0"/>
+        </w:rPr>
+        <w:t xml:space="preserve"> de la UPAO. Puede leer directamente una cámara IP (RTSP), pero no se integra con el sistema que la gestiona.</w:t>
       </w:r>
       <w:r>
         <w:rPr>
@@ -2776,7 +2825,7 @@
           <w:color w:val="1f1f1f"/>
           <w:rtl w:val="0"/>
         </w:rPr>
-        <w:t xml:space="preserve">Procesamiento de cámara única en V1:</w:t>
+        <w:t>Procesamiento de cámara única:</w:t>
       </w:r>
       <w:r>
         <w:rPr>
@@ -3130,7 +3179,7 @@
                 <w:color w:val="1f1f1f"/>
                 <w:rtl w:val="0"/>
               </w:rPr>
-              <w:t xml:space="preserve">Algoritmo de seguimiento IoU (V1)</w:t>
+              <w:t>Algoritmo de seguimiento IoU</w:t>
             </w:r>
             <w:r>
               <w:rPr>
@@ -3151,7 +3200,7 @@
                 <w:color w:val="1f1f1f"/>
                 <w:rtl w:val="0"/>
               </w:rPr>
-              <w:t xml:space="preserve">Algoritmo de seguimiento multiobjeto en tiempo real (~30 líneas) que preserva la identidad (ID) de transeúntes u objetos en escaleras ante oclusiones mediante IoU &gt; 0.25 y OCCLUSION_SECONDS = 1.0. En la versión V1 del sistema se implementa de manera propia en lugar del ByteTrack de Ultralytics, para evitar el arrastre de estado interno entre llamadas.</w:t>
+              <w:t>Algoritmo de seguimiento multiobjeto propio que preserva la identidad (ID) de cada persona en la escalera asociando cajas por solapamiento (IoU &gt; 0.25) y tolerando oclusiones de 1.0 s. Se prefirió al ByteTrack de Ultralytics para evitar el arrastre de estado interno entre llamadas.</w:t>
             </w:r>
             <w:r>
               <w:rPr>
@@ -4191,14 +4240,14 @@
       <w:bookmarkEnd w:id="12"/>
       <w:r>
         <w:rPr>
-          <w:b w:val="1"/>
+          <w:b/>
           <w:bCs w:val="1"/>
           <w:color w:val="1f1f1f"/>
           <w:sz w:val="22"/>
           <w:szCs w:val="22"/>
           <w:rtl w:val="0"/>
         </w:rPr>
-        <w:t>Ministerio de Justicia y Derechos Humanos (ANPD):</w:t>
+        <w:t>Datasets realmente utilizados en el Modelo S7 v4:</w:t>
       </w:r>
       <w:r>
         <w:rPr>
@@ -4207,7 +4256,7 @@
           <w:szCs w:val="22"/>
           <w:rtl w:val="0"/>
         </w:rPr>
-        <w:t xml:space="preserve"> Directiva N.º 01-2020-JUS/DGTAIPD - Tratamiento de datos personales mediante sistemas de videovigilancia; y Reglamento de la Ley N.º 29733 (D.S. N.º 016-2024-JUS).</w:t>
+        <w:t xml:space="preserve"> Fall Detection Dataset (Kaggle), Stairs (Kaggle) y MOT15 (Kaggle), unificados en el repositorio de Hugging Face andres31416/stairs_fallhuman; Le2i Fall Detection (versión raw, clase de pérdida de equilibrio); y videos propios de las escaleras de la UPAO (fine-tuning). SisFall, FDD, URFD y PPGIA-UNIFOR se consultaron como referencia pero no se usaron por requerir registro o no aportar cajas delimitadoras.</w:t>
       </w:r>
       <w:r>
         <w:rPr>
@@ -4243,7 +4292,7 @@
           <w:szCs w:val="22"/>
           <w:rtl w:val="0"/>
         </w:rPr>
-        <w:t>ISO/IEC 20889 e ISO/IEC 27701:</w:t>
+        <w:t>Ministerio de Justicia y Derechos Humanos (ANPD):</w:t>
       </w:r>
       <w:r>
         <w:rPr>
@@ -4252,7 +4301,7 @@
           <w:szCs w:val="22"/>
           <w:rtl w:val="0"/>
         </w:rPr>
-        <w:t xml:space="preserve"> técnicas de desidentificación de datos y gestión de la información de privacidad, aplicadas a la anonimización de la evidencia.</w:t>
+        <w:t xml:space="preserve"> Directiva N.º 01-2020-JUS/DGTAIPD - Tratamiento de datos personales mediante sistemas de videovigilancia; y Reglamento de la Ley N.º 29733 (D.S. N.º 016-2024-JUS).</w:t>
       </w:r>
       <w:r>
         <w:rPr>
@@ -4288,6 +4337,51 @@
           <w:szCs w:val="22"/>
           <w:rtl w:val="0"/>
         </w:rPr>
+        <w:t>ISO/IEC 20889 e ISO/IEC 27701:</w:t>
+      </w:r>
+      <w:r>
+        <w:rPr>
+          <w:color w:val="1f1f1f"/>
+          <w:sz w:val="22"/>
+          <w:szCs w:val="22"/>
+          <w:rtl w:val="0"/>
+        </w:rPr>
+        <w:t xml:space="preserve"> técnicas de desidentificación de datos y gestión de la información de privacidad, aplicadas a la anonimización de la evidencia.</w:t>
+      </w:r>
+      <w:r>
+        <w:rPr>
+          <w:rtl w:val="0"/>
+        </w:rPr>
+      </w:r>
+    </w:p>
+    <w:p>
+      <w:pPr>
+        <w:pStyle w:val="Heading3"/>
+        <w:keepNext w:val="0"/>
+        <w:keepLines w:val="0"/>
+        <w:widowControl w:val="0"/>
+        <w:numPr>
+          <w:ilvl w:val="0"/>
+          <w:numId w:val="13"/>
+        </w:numPr>
+        <w:spacing w:after="220" w:before="0" w:line="324.00000000000006" w:lineRule="auto"/>
+        <w:ind w:left="720" w:hanging="360"/>
+        <w:rPr>
+          <w:rFonts w:ascii="Roboto" w:cs="Roboto" w:eastAsia="Roboto" w:hAnsi="Roboto"/>
+          <w:color w:val="1f1f1f"/>
+        </w:rPr>
+      </w:pPr>
+      <w:bookmarkStart w:colFirst="0" w:colLast="0" w:name="_p3sauto1veo" w:id="12"/>
+      <w:bookmarkEnd w:id="12"/>
+      <w:r>
+        <w:rPr>
+          <w:b w:val="1"/>
+          <w:bCs w:val="1"/>
+          <w:color w:val="1f1f1f"/>
+          <w:sz w:val="22"/>
+          <w:szCs w:val="22"/>
+          <w:rtl w:val="0"/>
+        </w:rPr>
         <w:t>Wang, X. et al. (2021):</w:t>
       </w:r>
       <w:r>
@@ -4537,7 +4631,7 @@
           <w:szCs w:val="22"/>
           <w:rtl w:val="0"/>
         </w:rPr>
-        <w:t xml:space="preserve">Incorpora el material complementario oficial: el Glosario Extendido (Apéndice A), la Descripción del Pipeline de Datos y Arquitectura en texto estructurado (Apéndice B), y la Matriz de Trazabilidad Completa (Apéndice C).</w:t>
+        <w:t>Incorpora el material complementario oficial: el Glosario Extendido (Apéndice A), la Descripción del Pipeline de Datos y Arquitectura (Apéndice B), la Matriz de Trazabilidad Completa (Apéndice C), los cambios de la versión de exposición (Apéndice D) y el estado real de cumplimiento de cada requisito (Apéndice E).</w:t>
       </w:r>
       <w:r>
         <w:rPr>
@@ -4925,7 +5019,7 @@
           <w:color w:val="1f1f1f"/>
           <w:rtl w:val="0"/>
         </w:rPr>
-        <w:t xml:space="preserve"> Mochilas, cajas, líquidos o elementos tirados en los peldaños que puedan provocar tropezones o resbalones.</w:t>
+        <w:t xml:space="preserve"> Mochilas, bolsos, maletas, botellas, libros o paraguas dejados en los peldaños (objetos que reconoce el detector COCO). Cajas, líquidos derramados o desniveles no forman parte de las clases del detector y no se detectan en esta versión.</w:t>
       </w:r>
       <w:r>
         <w:rPr>
@@ -5139,7 +5233,7 @@
           <w:color w:val="1f1f1f"/>
           <w:rtl w:val="0"/>
         </w:rPr>
-        <w:t xml:space="preserve"> El sistema presenta la alerta en la pantalla del personal de seguridad de forma clara. Cada notificación muestra la cámara que captó el hecho, la fecha y hora exactas, el tipo de riesgo identificado y una foto del momento preciso en que se detectó el problema.</w:t>
+        <w:t xml:space="preserve"> El sistema presenta la alerta en la pantalla del personal de seguridad de forma clara. Cada notificación muestra la fecha y hora exactas, el tipo de riesgo y su severidad (con color), la duración, el ID de seguimiento y una foto anotada y con los rostros anonimizados del momento del incidente. La cámara de origen no se indica, porque esta versión trabaja con una sola cámara.</w:t>
       </w:r>
       <w:r>
         <w:rPr>
@@ -5658,7 +5752,7 @@
           <w:color w:val="1f1f1f"/>
           <w:rtl w:val="0"/>
         </w:rPr>
-        <w:t xml:space="preserve"> para salvaguardar la confidencialidad, integridad y disponibilidad de las grabaciones de video, evitando accesos no autorizados y protegiendo los canales de transmisión entre la cámara, el servidor de cómputo y el panel de supervisión.</w:t>
+        <w:t xml:space="preserve"> para salvaguardar la confidencialidad, integridad y disponibilidad de las imágenes, evitando accesos no autorizados. Estado actual: el acceso al panel se protege con un token (PANEL_TOKEN) y las evidencias se anonimizan; la transmisión entre servidor y navegador no está cifrada (HTTP), por lo que el sistema debe usarse en una red local de confianza o detrás de un proxy HTTPS.</w:t>
       </w:r>
       <w:r>
         <w:rPr>
@@ -6151,7 +6245,7 @@
           <w:color w:val="1f1f1f"/>
           <w:rtl w:val="0"/>
         </w:rPr>
-        <w:t xml:space="preserve">, utilizando datasets públicos especializados de detección de caídas (Le2i, SisFall, FDD, URFD, PPGIA-UNIFOR TsetFall Dataset) e imágenes de escaleras universitarias, exigiendo auditorías sobre la completitud del etiquetado y la precisión postural.</w:t>
+        <w:t>, utilizando datasets públicos de detección de caídas y personas (Fall Detection Dataset, Stairs y MOT15 de Kaggle, unificados en Hugging Face, y Le2i) e imágenes de las escaleras de la UPAO, con partición por video para evitar fuga de datos y auditoría del etiquetado (training/audit_datasets.py).</w:t>
       </w:r>
       <w:r>
         <w:rPr>
@@ -6485,7 +6579,7 @@
         <w:rPr>
           <w:rtl w:val="0"/>
         </w:rPr>
-        <w:t xml:space="preserve">Se asume que los datasets de entrenamiento (secuencias de caídas Le2i, SisFall, FDD, URFD, PPGIA-UNIFOR TsetFall Dataset complementados con tomas de escaleras UPAO) son representativos para alcanzar una precisión promedio media (</w:t>
+        <w:t>Se asume que los datasets de entrenamiento (Fall Detection Dataset, Stairs, MOT15, Le2i y videos de escaleras de la UPAO) son representativos para alcanzar una precisión promedio media (</w:t>
       </w:r>
       <w:r>
         <w:rPr>
@@ -7377,6 +7471,13 @@
               </w:rPr>
               <w:t xml:space="preserve">El sistema debe presentar visualmente en el panel de supervisión la información detallada de la alerta emitida, mostrando la captura del fotograma del incidente en la escalera junto con los datos asociados (cámara/ubicación, fecha, hora, categoría de riesgo e ID de seguimiento) para la revisión del personal de seguridad.</w:t>
             </w:r>
+            <w:r>
+              <w:rPr>
+                <w:rtl w:val="0"/>
+              </w:rPr>
+              <w:br/>
+              <w:t>Nota de implementación (versión de exposición): CUMPLE PARCIALMENTE. El panel muestra foto, fecha y hora, tipo, severidad, duración e ID de seguimiento, con descarga en ZIP y borrado. No muestra la cámara o ubicación (una sola cámara en esta versión).</w:t>
+            </w:r>
           </w:p>
         </w:tc>
       </w:tr>
@@ -7813,6 +7914,13 @@
               </w:rPr>
               <w:t xml:space="preserve">El panel de supervisión debe presentar la información de cada alerta en un diseño visual estructurado que consolide en un solo bloque la cámara/escalera de origen, fecha, hora exacta, categoría de riesgo detectada, ID de seguimiento y la captura del fotograma de la imprudencia o caída, permitiendo reconocer de inmediato la situación.</w:t>
             </w:r>
+            <w:r>
+              <w:rPr>
+                <w:rtl w:val="0"/>
+              </w:rPr>
+              <w:br/>
+              <w:t>Nota de implementación (versión de exposición): CUMPLE PARCIALMENTE. Cada alerta se muestra en un bloque con foto, fecha y hora, tipo, severidad e ID; falta la cámara de origen.</w:t>
+            </w:r>
           </w:p>
         </w:tc>
       </w:tr>
@@ -8249,6 +8357,13 @@
               </w:rPr>
               <w:t xml:space="preserve">La interfaz del panel de supervisión debe emplear esquemas de diferenciación cromática de alto contraste entre el estado de monitoreo normal y el estado de emisión de alerta, evitando que el personal de seguridad confunda o pase por alto una notificación de riesgo activo.</w:t>
             </w:r>
+            <w:r>
+              <w:rPr>
+                <w:rtl w:val="0"/>
+              </w:rPr>
+              <w:br/>
+              <w:t>Nota de implementación (versión de exposición): CUMPLE. Rojo (ALTO), ámbar (MEDIO) y verde (BAJO) en cajas, tarjetas de alerta y estado.</w:t>
+            </w:r>
           </w:p>
         </w:tc>
       </w:tr>
@@ -8685,6 +8800,13 @@
               </w:rPr>
               <w:t xml:space="preserve">El panel de supervisión debe mantener visible un indicador de estado en pantalla que informe de forma permanente al usuario si la transmisión del video de la cámara y el motor de análisis en tiempo real se encuentran activos y funcionando correctamente.</w:t>
             </w:r>
+            <w:r>
+              <w:rPr>
+                <w:rtl w:val="0"/>
+              </w:rPr>
+              <w:br/>
+              <w:t>Nota de implementación (versión de exposición): CUMPLE PARCIALMENTE. El panel muestra OPERATIVO / DEGRADADO en la tarjeta «Estado del sistema» durante el análisis y consulta /api/health cada 3 s; no hay un indicador fijo en la cabecera.</w:t>
+            </w:r>
           </w:p>
         </w:tc>
       </w:tr>
@@ -9121,6 +9243,13 @@
               </w:rPr>
               <w:t xml:space="preserve">El sistema debe requerir la autenticación obligatoria del usuario mediante credenciales (nombre de usuario y contraseña) antes de permitir el acceso y la visualización de la pantalla del panel de supervisión y de las alertas emitidas, restringiendo la interfaz exclusivamente al personal de seguridad y supervisores autorizados.</w:t>
             </w:r>
+            <w:r>
+              <w:rPr>
+                <w:rtl w:val="0"/>
+              </w:rPr>
+              <w:br/>
+              <w:t>Nota de implementación (versión de exposición): CUMPLE PARCIALMENTE. Acceso con un token compartido (PANEL_TOKEN, comparación en tiempo constante); no hay usuarios ni contraseñas individuales. Si no se define la variable, el panel queda abierto (modo laboratorio) y lo indica /api/health.</w:t>
+            </w:r>
           </w:p>
         </w:tc>
       </w:tr>
@@ -9554,6 +9683,13 @@
               </w:rPr>
               <w:t xml:space="preserve">El sistema debe capturar de manera continua la señal de video transmitida por la cámara fija instalada en la escalera del campus UPAO, asegurando la ingesta ininterrumpida de fotogramas para su análisis en tiempo real.</w:t>
             </w:r>
+            <w:r>
+              <w:rPr>
+                <w:rtl w:val="0"/>
+              </w:rPr>
+              <w:br/>
+              <w:t>Nota de implementación (versión de exposición): CUMPLE. Cámara del navegador (getUserMedia → /api/frame, ~30 FPS) y cámara del servidor o IP RTSP (/api/stream).</w:t>
+            </w:r>
           </w:p>
         </w:tc>
       </w:tr>
@@ -10156,6 +10292,13 @@
               </w:rPr>
               <w:t xml:space="preserve">El sistema debe detectar e identificar en tiempo real objetos y conductas pertenecientes a cuatro (4) categorías de riesgo definidas en escaleras: (1) objetos u obstáculos abandonados en escalones, (2) no uso del pasamanos durante el tránsito, (3) distracciones peligrosas (uso de celular/lectura), y (4) caídas activas o pérdida inminente de equilibrio.</w:t>
             </w:r>
+            <w:r>
+              <w:rPr>
+                <w:rtl w:val="0"/>
+              </w:rPr>
+              <w:br/>
+              <w:t>Nota de implementación (versión de exposición): CUMPLE. (1) Objetos COCO sobre el escalón: mochila, bolso, maleta, botella, libro, paraguas. (2) Pasamanos y (3) distracción: reglas sobre los puntos de MediaPipe Pose, más teléfono detectado junto a la cara. (4) Caída y pérdida de equilibrio: Modelo S7 v4 + geometría de pose + tambaleo. Las categorías (2) y (3) no se han medido cuantitativamente por falta de datos etiquetados.</w:t>
+            </w:r>
           </w:p>
         </w:tc>
       </w:tr>
@@ -10549,6 +10692,13 @@
               </w:rPr>
               <w:t xml:space="preserve">El sistema debe diferenciar entre la presencia de peatones en tránsito seguro (postura erguida, sujeción de barandilla) y conductas de riesgo (descenso distraído mirando el teléfono o tránsito sin sujetarse del pasamanos).</w:t>
             </w:r>
+            <w:r>
+              <w:rPr>
+                <w:rtl w:val="0"/>
+              </w:rPr>
+              <w:br/>
+              <w:t>Nota de implementación (versión de exposición): CUMPLE. Cada persona recibe BAJO / MEDIO / ALTO y la escena un veredicto global. La sujeción del pasamanos se infiere de la posición de las muñecas; la barandilla no se detecta como objeto.</w:t>
+            </w:r>
           </w:p>
         </w:tc>
       </w:tr>
@@ -10942,6 +11092,13 @@
               </w:rPr>
               <w:t xml:space="preserve">El sistema debe aplicar un filtro de decisión basado en umbrales de confianza (confidence threshold) para descartar detecciones con baja certeza matemática, estableciendo un umbral mínimo configurable (por defecto 75% para pre-filtrado de detección y 85% para confirmación de alerta).</w:t>
             </w:r>
+            <w:r>
+              <w:rPr>
+                <w:rtl w:val="0"/>
+              </w:rPr>
+              <w:br/>
+              <w:t>Nota de implementación (versión de exposición): DESVIACIÓN CONSCIENTE. Los umbrales 75% / 85% existen y son configurables (configs/app.yaml), pero la puerta de disparo de alertas es 0.35: las confianzas reales del detector están entre 0.2 y 0.9 (mediana de caída 0.39) y con 0.75 no se emitía ninguna alerta. El umbral del detector (0.25 por defecto) se ajusta desde el panel.</w:t>
+            </w:r>
           </w:p>
         </w:tc>
       </w:tr>
@@ -11343,6 +11500,13 @@
               </w:rPr>
               <w:t xml:space="preserve">El sistema debe mantener la identidad única (ID de seguimiento) de cada peatón u objeto en la escalera a lo largo del tiempo mediante un algoritmo de seguimiento IoU propio, conservando el rastreo incluso ante oclusiones temporales entre personas de hasta un (1) segundo continuo.</w:t>
             </w:r>
+            <w:r>
+              <w:rPr>
+                <w:rtl w:val="0"/>
+              </w:rPr>
+              <w:br/>
+              <w:t>Nota de implementación (versión de exposición): CUMPLE. Seguimiento IoU propio (IoU &gt; 0.25, oclusión de 1 s). Se aplica a personas; los objetos no reciben ID de seguimiento.</w:t>
+            </w:r>
           </w:p>
         </w:tc>
       </w:tr>
@@ -11734,9 +11898,9 @@
               <w:rPr>
                 <w:rtl w:val="0"/>
               </w:rPr>
-              <w:t xml:space="preserve">El sistema debe verificar que una condición de riesgo (como imprudencia sostenida o presencia de obstáculo) permanezca un tiempo mínimo según su nivel de riesgo (ALTO: 1.2 s, MEDIO: 0.6 s, con histéresis de 1.0 s) antes de emitir una alerta confirmada; exceptuando la categoría de caída activa, la cual se alertará de manera inmediata sin esperar dicho umbral.</w:t>
-              <w:br w:type="textWrapping"/>
-              <w:t xml:space="preserve">Nota de implementación (V1): El motor de riesgo aplica umbrales de persistencia por nivel de riesgo — PERSIST_SECONDS = {"ALTO": 1.2, "MEDIO": 0.6} — con histéresis PERSIST_GRACE = 1.0 s y enfriamiento ALERT_COOLDOWN = 15.0 s por identidad y tipo.</w:t>
+              <w:t>El sistema debe verificar que una condición de riesgo (como imprudencia sostenida o presencia de obstáculo) permanezca un tiempo mínimo según su nivel de riesgo (ALTO: 1.2 s, MEDIO: 0.6 s, con histéresis de 1.0 s) antes de emitir una alerta confirmada; exceptuando la categoría de caída activa, la cual se alertará de manera inmediata sin esperar dicho umbral.</w:t>
+              <w:br/>
+              <w:t>Nota de implementación (versión de exposición): DESVIACIÓN CONSCIENTE. La caída activa NO se alerta de inmediato: también exige 1.2 s (nivel ALTO) para filtrar falsos positivos; una caída vista solo por el recorte del detector debe además repetirse 3 fotogramas seguidos. MEDIO: 0.6 s. Histéresis 1.0 s y enfriamiento de 15 s por persona y tipo (configs/app.yaml → persistence).</w:t>
             </w:r>
           </w:p>
         </w:tc>
@@ -12139,6 +12303,13 @@
               </w:rPr>
               <w:t xml:space="preserve">El sistema debe generar y transmitir una notificación de alerta estructurada una vez confirmada la condición de riesgo o caída en la escalera, incluyendo la ubicación de la cámara, fecha, hora exacta, categoría del riesgo, ID de seguimiento y la captura del fotograma del incidente.</w:t>
             </w:r>
+            <w:r>
+              <w:rPr>
+                <w:rtl w:val="0"/>
+              </w:rPr>
+              <w:br/>
+              <w:t>Nota de implementación (versión de exposición): CUMPLE PARCIALMENTE. La alerta incluye ID, fecha y hora, tipo, referencia del requisito, severidad, descripción, ID de seguimiento, confianza, caja, duración y la foto anotada y anonimizada. No incluye la ubicación de la cámara. El panel la recibe en la siguiente respuesta en vivo y el historial se refresca cada 3 s.</w:t>
+            </w:r>
           </w:p>
         </w:tc>
       </w:tr>
@@ -13028,6 +13199,13 @@
               </w:rPr>
               <w:t xml:space="preserve">El sistema debe transmitir y desplegar la notificación de alerta en el panel de supervisión con una latencia máxima menor a quinientos (500) milisegundos, contados inmediatamente después de que se confirme el cumplimiento de la regla de persistencia temporal del riesgo (tiempo mínimo según nivel: ALTO 1.2 s, MEDIO 0.6 s, con histéresis 1.0 s).</w:t>
             </w:r>
+            <w:r>
+              <w:rPr>
+                <w:rtl w:val="0"/>
+              </w:rPr>
+              <w:br/>
+              <w:t>Nota de implementación (versión de exposición): CUMPLE. En la cámara en vivo la alerta llega en la siguiente respuesta del servidor (4-5 ms por petición, ~33 ms entre fotogramas). El historial de alertas del panel se refresca cada 3 s.</w:t>
+            </w:r>
           </w:p>
         </w:tc>
       </w:tr>
@@ -13464,6 +13642,13 @@
               </w:rPr>
               <w:t xml:space="preserve">El sistema debe garantizar la ingesta y procesamiento ininterrumpido de un (1) flujo continuo de video proveniente de la cámara fija de la escalera, manteniendo la captura completa sin descarte ni pérdida involuntaria de fotogramas por saturación de búfer.</w:t>
             </w:r>
+            <w:r>
+              <w:rPr>
+                <w:rtl w:val="0"/>
+              </w:rPr>
+              <w:br/>
+              <w:t>Nota de implementación (versión de exposición): DESVIACIÓN CONSCIENTE. En vivo se prioriza el fotograma más reciente: si la inferencia se atrasa, se descartan fotogramas intermedios (cola máxima de 3) para no acumular retraso; el video se muestra completo. En la pestaña Video se analizan todos los fotogramas.</w:t>
+            </w:r>
           </w:p>
         </w:tc>
       </w:tr>
@@ -14345,6 +14530,13 @@
               </w:rPr>
               <w:t xml:space="preserve">El sistema debe ejecutar sus algoritmos de análisis de video por computadora e inferencia continua en GPU de manera aislada y eficiente, garantizando que el consumo intensivo de recursos gráficos y de procesamiento no cause bloqueos en los controladores de video, congelamiento del sistema operativo anfitrión ni degrada la fluidez de la interfaz del panel de supervisión.</w:t>
             </w:r>
+            <w:r>
+              <w:rPr>
+                <w:rtl w:val="0"/>
+              </w:rPr>
+              <w:br/>
+              <w:t>Nota de implementación (versión de exposición): CUMPLE. La inferencia y la mejora de video corren en hilos propios del servidor; el panel nunca espera a la inferencia (modo asíncrono).</w:t>
+            </w:r>
           </w:p>
         </w:tc>
       </w:tr>
@@ -14781,6 +14973,13 @@
               </w:rPr>
               <w:t xml:space="preserve">El sistema debe operar exclusivamente como una herramienta de supervisión pasiva y apoyo a la decisión mediante la emisión de alertas en pantalla, quedando explícitamente restringido de ejecutar controles automáticos sobre actuadores físicos o bloqueos mecánicos en la escalera que puedan asustar a los transeúntes o provocar tropiezos secundarios.</w:t>
             </w:r>
+            <w:r>
+              <w:rPr>
+                <w:rtl w:val="0"/>
+              </w:rPr>
+              <w:br/>
+              <w:t>Nota de implementación (versión de exposición): CUMPLE. El sistema solo emite alertas en pantalla; no controla ningún actuador.</w:t>
+            </w:r>
           </w:p>
         </w:tc>
       </w:tr>
@@ -15253,6 +15452,13 @@
               </w:rPr>
               <w:t xml:space="preserve">La interfaz del panel de supervisión debe ser legible e intuitiva para el personal de seguridad sin formación en ingeniería ni sistemas informáticos, permitiendo que un operador sea capaz de identificar e interpretar correctamente la información de una alerta de prueba mostrada en pantalla sin necesidad de consultar manuales técnicos ni requerir capacitación especializada.</w:t>
             </w:r>
+            <w:r>
+              <w:rPr>
+                <w:rtl w:val="0"/>
+              </w:rPr>
+              <w:br/>
+              <w:t>Nota de implementación (versión de exposición): NO VERIFICADO. El panel usa colores y textos claros, pero no se han hecho pruebas con personal de seguridad.</w:t>
+            </w:r>
           </w:p>
         </w:tc>
       </w:tr>
@@ -16149,6 +16355,13 @@
               </w:rPr>
               <w:t xml:space="preserve">El sistema debe garantizar su disponibilidad e ingesta ininterrumpida de video durante el horario operativo de tránsito peatonal en el campus de la UPAO, asegurando el monitoreo continuo de las escaleras sin asumir un funcionamiento de 24 horas los 7 días de la semana.</w:t>
             </w:r>
+            <w:r>
+              <w:rPr>
+                <w:rtl w:val="0"/>
+              </w:rPr>
+              <w:br/>
+              <w:t>Nota de implementación (versión de exposición): DEPENDE DEL DESPLIEGUE (horario de funcionamiento del equipo).</w:t>
+            </w:r>
           </w:p>
         </w:tc>
       </w:tr>
@@ -16585,6 +16798,13 @@
               </w:rPr>
               <w:t xml:space="preserve">El motor de análisis visual debe mantener la estabilidad en la detección de posturas y clasificación de riesgos sin sufrir degradación severa ante variaciones habituales de iluminación en la escalera, como cambios de luz natural o sombras producidas por el paso de transeúntes.</w:t>
             </w:r>
+            <w:r>
+              <w:rPr>
+                <w:rtl w:val="0"/>
+              </w:rPr>
+              <w:br/>
+              <w:t>Nota de implementación (versión de exposición): CUMPLE PARCIALMENTE. Aumentos de brillo y color (HSV) en el entrenamiento; no hay una medición formal con distintas iluminaciones.</w:t>
+            </w:r>
           </w:p>
         </w:tc>
       </w:tr>
@@ -17021,6 +17241,13 @@
               </w:rPr>
               <w:t xml:space="preserve">Ante una interrupción o pérdida temporal de la señal de video de la cámara fija de la escalera, el sistema debe ejecutar un mecanismo de reconexión automática que restablezca la ingesta y el análisis en cuanto la transmisión se reanude, sin requerir la intervención del operador.</w:t>
             </w:r>
+            <w:r>
+              <w:rPr>
+                <w:rtl w:val="0"/>
+              </w:rPr>
+              <w:br/>
+              <w:t>Nota de implementación (versión de exposición): CUMPLE. Webcam: hasta 5 reintentos con espera creciente y reconexión si se corta la pista. Cámara IP/USB: reconexión automática en /api/stream.</w:t>
+            </w:r>
           </w:p>
         </w:tc>
       </w:tr>
@@ -17465,6 +17692,13 @@
               </w:rPr>
               <w:t xml:space="preserve">El sistema debe restringir la visualización y acceso a los flujos de video, fotogramas de evidencia e información de eventos exclusivamente al personal autorizados, garantizando la protección de los datos personales de las personas captadas en las escaleras según la Ley N.º 29733 y la norma ISO/IEC 27001.</w:t>
             </w:r>
+            <w:r>
+              <w:rPr>
+                <w:rtl w:val="0"/>
+              </w:rPr>
+              <w:br/>
+              <w:t>Nota de implementación (versión de exposición): CUMPLE PARCIALMENTE. Toda evidencia guardada se anonimiza (rostros pixelados) y el panel se protege con token si se define PANEL_TOKEN. La conexión no está cifrada (HTTP) y el video en vivo se muestra sin anonimizar al personal que accede al panel.</w:t>
+            </w:r>
           </w:p>
         </w:tc>
       </w:tr>
@@ -17901,6 +18135,13 @@
               </w:rPr>
               <w:t xml:space="preserve">El sistema debe garantizar que la estructura de datos correspondiente a cada alerta emitida (fecha, hora, categoría de riesgo, ID de seguimiento y captura del fotograma) permanezca inalterada y protegida contra corrupciones o modificaciones no autorizadas durante su transmisión y despliegue en el panel.</w:t>
             </w:r>
+            <w:r>
+              <w:rPr>
+                <w:rtl w:val="0"/>
+              </w:rPr>
+              <w:br/>
+              <w:t>Nota de implementación (versión de exposición): CUMPLE PARCIALMENTE. Imagen y registro se escriben y se borran juntos y las rutas están protegidas; no hay firma ni hash que detecte una modificación posterior.</w:t>
+            </w:r>
           </w:p>
         </w:tc>
       </w:tr>
@@ -18337,6 +18578,13 @@
               </w:rPr>
               <w:t xml:space="preserve">El sistema debe generar y conservar un registro de eventos (log) inalterable para cada alerta confirmada, asociando la marca de tiempo, cámara de origen, tipo de riesgo e ID de seguimiento, permitiendo la auditoría posterior del comportamiento de las detecciones conforme a los requerimientos de gobernanza de la norma ISO/IEC 42001.</w:t>
             </w:r>
+            <w:r>
+              <w:rPr>
+                <w:rtl w:val="0"/>
+              </w:rPr>
+              <w:br/>
+              <w:t>Nota de implementación (versión de exposición): CUMPLE PARCIALMENTE. Registro append-only (alertas.jsonl) con fecha, tipo, severidad e ID de seguimiento. No incluye la cámara de origen y su inalterabilidad depende de los permisos del sistema de archivos (sin firma criptográfica); el panel permite borrar alertas.</w:t>
+            </w:r>
           </w:p>
         </w:tc>
       </w:tr>
@@ -18773,6 +19021,13 @@
               </w:rPr>
               <w:t xml:space="preserve">El sistema debe proteger los archivos de configuración, los umbrales de detección definidos y los pesos del modelo de visión por computadora contra alteraciones, escrituras o manipulaciones no autorizadas dentro del entorno local de ejecución.</w:t>
             </w:r>
+            <w:r>
+              <w:rPr>
+                <w:rtl w:val="0"/>
+              </w:rPr>
+              <w:br/>
+              <w:t>Nota de implementación (versión de exposición): CUMPLE PARCIALMENTE. Los pesos se verifican con SHA-256 (tools/download_models.py, tools/check_env.py) a demanda, no en cada arranque. La configuración se protege con los permisos del sistema operativo.</w:t>
+            </w:r>
           </w:p>
         </w:tc>
       </w:tr>
@@ -19209,6 +19464,13 @@
               </w:rPr>
               <w:t xml:space="preserve">El sistema debe vincular de manera inalterable la captura del fotograma del incidente en la escalera con su respectiva marca de tiempo, ID de seguimiento y tipo de riesgo, asegurando la validez técnica del registro como evidencia incontestable para la prevención de accidentes.</w:t>
             </w:r>
+            <w:r>
+              <w:rPr>
+                <w:rtl w:val="0"/>
+              </w:rPr>
+              <w:br/>
+              <w:t>Nota de implementación (versión de exposición): CUMPLE PARCIALMENTE. La foto y su línea de registro se vinculan por marca de tiempo e ID; no hay firma digital.</w:t>
+            </w:r>
           </w:p>
         </w:tc>
       </w:tr>
@@ -19653,6 +19915,13 @@
               </w:rPr>
               <w:t xml:space="preserve">El sistema debe estar estructurado en componentes independientes y desacoplados (módulo de ingesta de video, motor de inferencia de visión por computadora, algoritmo de seguimiento de objetos, evaluador de persistencia temporal de riesgo e interfaz de usuario), garantizando que las modificaciones o mantenimiento realizados en la lógica interna de un módulo no alteren de forma no deseada el funcionamiento de los demás componentes.</w:t>
             </w:r>
+            <w:r>
+              <w:rPr>
+                <w:rtl w:val="0"/>
+              </w:rPr>
+              <w:br/>
+              <w:t>Nota de implementación (versión de exposición): CUMPLE. Capas independientes: frontend, api, services, perception, enhancement, privacy, rendering (ver Apéndice B).</w:t>
+            </w:r>
           </w:p>
         </w:tc>
       </w:tr>
@@ -20089,6 +20358,13 @@
               </w:rPr>
               <w:t xml:space="preserve">El sistema debe permitir el ajuste de los umbrales de confianza para detección y alerta, la modificación del tiempo de persistencia temporal del riesgo y la actualización o sustitución de los archivos de pesos del modelo de visión por computadora mediante archivos de configuración externos, sin requerir la modificación ni recompilación del código fuente de la aplicación.</w:t>
             </w:r>
+            <w:r>
+              <w:rPr>
+                <w:rtl w:val="0"/>
+              </w:rPr>
+              <w:br/>
+              <w:t>Nota de implementación (versión de exposición): CUMPLE. configs/app.yaml y la opción --set permiten cambiar umbrales, persistencia, cadencias y pesos sin tocar el código.</w:t>
+            </w:r>
           </w:p>
         </w:tc>
       </w:tr>
@@ -20525,6 +20801,13 @@
               </w:rPr>
               <w:t xml:space="preserve">El sistema debe permitir la ejecución de pruebas de software y validación algorítmica utilizando archivos o secuencias de video pregrabadas como fuente de entrada alternativa a la transmisión en vivo de la cámara física, facilitando la verificación del rendimiento del modelo y la comprobación de la generación de alertas en entornos de desarrollo y pruebas.</w:t>
             </w:r>
+            <w:r>
+              <w:rPr>
+                <w:rtl w:val="0"/>
+              </w:rPr>
+              <w:br/>
+              <w:t>Nota de implementación (versión de exposición): CUMPLE. Pestaña Video (procesa un MP4 completo y genera alertas) y pruebas automáticas en tests/.</w:t>
+            </w:r>
           </w:p>
         </w:tc>
       </w:tr>
@@ -20961,6 +21244,13 @@
               </w:rPr>
               <w:t xml:space="preserve">El sistema debe generar un registro de diagnóstico técnico (log de sistema) que registre errores de ejecución, excepciones en el procesamiento gráfico e interrupciones en la ingesta del flujo de video, permitiendo al equipo de desarrollo e ingeniería analizar e identificar la causa raíz de fallos o degradaciones operativas del software.</w:t>
             </w:r>
+            <w:r>
+              <w:rPr>
+                <w:rtl w:val="0"/>
+              </w:rPr>
+              <w:br/>
+              <w:t>Nota de implementación (versión de exposición): CUMPLE PARCIALMENTE. Los errores se escriben en la salida del servidor y /api/health expone contadores de fallos; no hay un archivo de log propio (se puede redirigir la salida a un archivo).</w:t>
+            </w:r>
           </w:p>
         </w:tc>
       </w:tr>
@@ -21405,6 +21695,13 @@
               </w:rPr>
               <w:t xml:space="preserve">El sistema debe permitir adaptarse a variaciones físicas u operativas en la zona de escaleras (como reubicaciones del ángulo de la cámara o cambios en las zonas de detección del pasamanos y peldaños) mediante archivos de configuración externos, sin reingeniería del código fuente.</w:t>
             </w:r>
+            <w:r>
+              <w:rPr>
+                <w:rtl w:val="0"/>
+              </w:rPr>
+              <w:br/>
+              <w:t>Nota de implementación (versión de exposición): CUMPLE PARCIALMENTE. Umbrales, cadencias y fuente de cámara son configurables; no existen zonas configurables de pasamanos o peldaños (el pasamanos se evalúa por postura).</w:t>
+            </w:r>
           </w:p>
         </w:tc>
       </w:tr>
@@ -21841,6 +22138,13 @@
               </w:rPr>
               <w:t xml:space="preserve">La arquitectura del software debe estar diseñada de forma modular para permitir la incorporación y análisis simultáneo de múltiples flujos continuos de video en fases futuras de expansión, sin requerir una reestructuración de la lógica central del pipeline de procesamiento de datos.</w:t>
             </w:r>
+            <w:r>
+              <w:rPr>
+                <w:rtl w:val="0"/>
+              </w:rPr>
+              <w:br/>
+              <w:t>Nota de implementación (versión de exposición): CUMPLE PARCIALMENTE. La arquitectura modular permite instanciar un motor por cámara, pero esta versión procesa una sola cámara.</w:t>
+            </w:r>
           </w:p>
         </w:tc>
       </w:tr>
@@ -22285,6 +22589,13 @@
               </w:rPr>
               <w:t xml:space="preserve">El sistema debe transicionar a un estado explícito de "Monitoreo No Operativo" y desplegar dicha condición de forma visible en el panel de supervisión ante cualquier fallo crítico (como la pérdida de la señal de video o detención del análisis en GPU), evitando generar una falsa sensación de vigilancia activa en las escaleras.</w:t>
             </w:r>
+            <w:r>
+              <w:rPr>
+                <w:rtl w:val="0"/>
+              </w:rPr>
+              <w:br/>
+              <w:t>Nota de implementación (versión de exposición): CUMPLE PARCIALMENTE. El estado pasa a DEGRADADO sin cámara o con fallos de pose/detección; si faltan los modelos el servidor no arranca e indica la causa. Un fallo de GPU en ejecución se informa como error en cada petición.</w:t>
+            </w:r>
           </w:p>
         </w:tc>
       </w:tr>
@@ -22468,7 +22779,7 @@
                 <w:bCs w:val="1"/>
                 <w:rtl w:val="0"/>
               </w:rPr>
-              <w:t xml:space="preserve">Algoritmo de seguimiento IoU (V1)</w:t>
+              <w:t>Algoritmo de seguimiento IoU</w:t>
             </w:r>
             <w:r>
               <w:rPr>
@@ -22488,7 +22799,7 @@
               <w:rPr>
                 <w:rtl w:val="0"/>
               </w:rPr>
-              <w:t xml:space="preserve">Algoritmo de seguimiento multiobjeto en tiempo real (~30 líneas) que mantiene la identidad de peatones u objetos en la escalera asociando cajas delimitadoras de alta y baja confianza mediante IoU &gt; 0.25 y OCCLUSION_SECONDS = 1.0. En la versión V1 del sistema se implementa de manera propia en lugar del ByteTrack de Ultralytics, para evitar el arrastre de estado interno entre llamadas.</w:t>
+              <w:t>Algoritmo de seguimiento multiobjeto propio que preserva la identidad (ID) de cada persona en la escalera asociando cajas por solapamiento (IoU &gt; 0.25) y tolerando oclusiones de 1.0 s. Se prefirió al ByteTrack de Ultralytics para evitar el arrastre de estado interno entre llamadas.</w:t>
             </w:r>
           </w:p>
         </w:tc>
@@ -22907,7 +23218,7 @@
               <w:rPr>
                 <w:rtl w:val="0"/>
               </w:rPr>
-              <w:t xml:space="preserve">Regla que exige que un comportamiento o riesgo en escalera permanezca un tiempo mínimo según su nivel de riesgo (ALTO: 1.2 s, MEDIO: 0.6 s, con histéresis de 1.0 s) antes de confirmar la alerta (salvo en caídas activas, que se alertan de manera inmediata). En la versión V1 se implementa con PERSIST_SECONDS = {"ALTO": 1.2, "MEDIO": 0.6} y PERSIST_GRACE = 1.0 s.</w:t>
+              <w:t>Regla que exige que un riesgo permanezca un tiempo mínimo según su nivel (ALTO: 1.2 s, MEDIO: 0.6 s, con histéresis de 1.0 s) antes de confirmar la alerta. Se aplica también a las caídas (no hay alerta inmediata).</w:t>
             </w:r>
           </w:p>
         </w:tc>
@@ -23009,7 +23320,7 @@
               <w:rPr>
                 <w:rtl w:val="0"/>
               </w:rPr>
-              <w:t xml:space="preserve"> Valor porcentual mínimo de certeza matemática para validar detecciones (75% pre-filtrado / 85% confirmación).</w:t>
+              <w:t xml:space="preserve"> Valor mínimo de certeza para validar detecciones (75% pre-filtrado / 85% confirmación, configurables). La alerta se dispara desde 0.35 (ver RQF04).</w:t>
             </w:r>
           </w:p>
         </w:tc>
@@ -23112,6 +23423,156 @@
                 <w:rtl w:val="0"/>
               </w:rPr>
               <w:t xml:space="preserve"> Arquitectura de red neuronal para detección rápida y precisa de objetos u obstáculos en escalones.</w:t>
+            </w:r>
+          </w:p>
+        </w:tc>
+      </w:tr>
+      <w:tr>
+        <w:trPr>
+          <w:cantSplit w:val="0"/>
+          <w:tblHeader w:val="0"/>
+        </w:trPr>
+        <w:tc>
+          <w:tcPr/>
+          <w:p>
+            <w:pPr>
+              <w:spacing w:line="276" w:lineRule="auto"/>
+              <w:rPr/>
+            </w:pPr>
+            <w:r>
+              <w:rPr>
+                <w:b w:val="1"/>
+                <w:bCs w:val="1"/>
+                <w:rtl w:val="0"/>
+              </w:rPr>
+              <w:t>Real-ESRGAN</w:t>
+            </w:r>
+            <w:r>
+              <w:rPr>
+                <w:rtl w:val="0"/>
+              </w:rPr>
+            </w:r>
+          </w:p>
+        </w:tc>
+        <w:tc>
+          <w:tcPr/>
+          <w:p>
+            <w:pPr>
+              <w:spacing w:line="276" w:lineRule="auto"/>
+              <w:rPr/>
+            </w:pPr>
+            <w:r>
+              <w:rPr>
+                <w:b w:val="1"/>
+                <w:bCs w:val="1"/>
+                <w:rtl w:val="0"/>
+              </w:rPr>
+              <w:t>Red generativa de superresolución x4. El sistema usa realesr-general-x4v3 (en vivo, ~22 ms por fotograma) y RealESRGAN_x4plus (imagen fija) para mejorar la calidad del video.</w:t>
+            </w:r>
+            <w:r>
+              <w:rPr>
+                <w:rtl w:val="0"/>
+              </w:rPr>
+            </w:r>
+          </w:p>
+        </w:tc>
+      </w:tr>
+      <w:tr>
+        <w:trPr>
+          <w:cantSplit w:val="0"/>
+          <w:tblHeader w:val="0"/>
+        </w:trPr>
+        <w:tc>
+          <w:tcPr/>
+          <w:p>
+            <w:pPr>
+              <w:spacing w:line="276" w:lineRule="auto"/>
+              <w:rPr/>
+            </w:pPr>
+            <w:r>
+              <w:rPr>
+                <w:b w:val="1"/>
+                <w:bCs w:val="1"/>
+                <w:rtl w:val="0"/>
+              </w:rPr>
+              <w:t>Anonimización</w:t>
+            </w:r>
+            <w:r>
+              <w:rPr>
+                <w:rtl w:val="0"/>
+              </w:rPr>
+            </w:r>
+          </w:p>
+        </w:tc>
+        <w:tc>
+          <w:tcPr/>
+          <w:p>
+            <w:pPr>
+              <w:spacing w:line="276" w:lineRule="auto"/>
+              <w:rPr/>
+            </w:pPr>
+            <w:r>
+              <w:rPr>
+                <w:b w:val="1"/>
+                <w:bCs w:val="1"/>
+                <w:rtl w:val="0"/>
+              </w:rPr>
+              <w:t>Pixelado irreversible de los rostros en toda imagen guardada como evidencia (Ley N.º 29733), con detección de caras de corto y largo alcance y respaldo sobre la cabeza de cada persona.</w:t>
+            </w:r>
+            <w:r>
+              <w:rPr>
+                <w:rtl w:val="0"/>
+              </w:rPr>
+            </w:r>
+          </w:p>
+        </w:tc>
+      </w:tr>
+      <w:tr>
+        <w:trPr>
+          <w:cantSplit w:val="0"/>
+          <w:tblHeader w:val="0"/>
+        </w:trPr>
+        <w:tc>
+          <w:tcPr/>
+          <w:p>
+            <w:pPr>
+              <w:spacing w:line="276" w:lineRule="auto"/>
+              <w:rPr/>
+            </w:pPr>
+            <w:r>
+              <w:rPr>
+                <w:b w:val="1"/>
+                <w:bCs w:val="1"/>
+                <w:rtl w:val="0"/>
+              </w:rPr>
+              <w:t>Modelo S7 v4</w:t>
+            </w:r>
+            <w:r>
+              <w:rPr>
+                <w:rtl w:val="0"/>
+              </w:rPr>
+            </w:r>
+          </w:p>
+        </w:tc>
+        <w:tc>
+          <w:tcPr/>
+          <w:p>
+            <w:pPr>
+              <w:spacing w:line="276" w:lineRule="auto"/>
+              <w:rPr/>
+            </w:pPr>
+            <w:r>
+              <w:rPr>
+                <w:b w:val="1"/>
+                <w:bCs w:val="1"/>
+                <w:rtl w:val="0"/>
+              </w:rPr>
+              <w:t>Detector propio YOLOv8s de 6 clases (release v1.2.0-escaleras-v4), mAP@0.5 0.776 en validación y 0.768 en test. Es el modelo definitivo del sistema.</w:t>
+            </w:r>
+            <w:r>
+              <w:rPr>
+                <w:rtl w:val="0"/>
+              </w:rPr>
             </w:r>
           </w:p>
         </w:tc>
@@ -23228,7 +23689,7 @@
           <w:rtl w:val="0"/>
         </w:rPr>
         <w:br/>
-        <w:t>- frontend/ (panel web, sin cambios) → backend/api/ (rutas Flask: analysis, alerts, system, auth) → backend/services/ (inferencer: hilo CUDA único con cola; live_enhancer: hilo de Real-ESRGAN; video_io) → núcleo backend/perception/ (engine, detectors, pose, tracking, alerts), backend/enhancement/ (Real-ESRGAN x4) y backend/privacy/ (anonimización).</w:t>
+        <w:t>- frontend/ (panel web; mismo plano, solo cambió el texto de la casilla de mejora) → backend/api/ (rutas Flask: analysis, alerts, system, auth) → backend/services/ (inferencer: hilo CUDA único con cola; live_enhancer: hilo de Real-ESRGAN; video_io) → núcleo backend/perception/ (engine, detectors, pose, tracking, alerts), backend/enhancement/ (Real-ESRGAN x4) y backend/privacy/ (anonimización).</w:t>
         <w:br/>
         <w:t>- Todos los modelos de detección se cargan en un único hilo persistente para que el contexto CUDA quede ligado a él (~29 ms frente a ~82 ms al reenlazarlo en cada hilo de Flask). La mejora de video en vivo corre en un hilo propio y se empareja con la detección por identificador de fotograma (frame_id).</w:t>
         <w:br/>
@@ -23347,13 +23808,13 @@
           <w:bCs w:val="1"/>
           <w:rtl w:val="0"/>
         </w:rPr>
-        <w:t xml:space="preserve">Procesamiento:</w:t>
-      </w:r>
-      <w:r>
-        <w:rPr>
-          <w:rtl w:val="0"/>
-        </w:rPr>
-        <w:t xml:space="preserve"> Captura ininterrumpida de fotogramas y almacenamiento en búfer de memoria gráfica sin pérdida de cuadros (conforme a </w:t>
+        <w:t>Procesamiento:</w:t>
+      </w:r>
+      <w:r>
+        <w:rPr>
+          <w:rtl w:val="0"/>
+        </w:rPr>
+        <w:t xml:space="preserve"> Recepción de fotogramas. En vivo se prioriza el más reciente y se descartan los atrasados para no acumular retraso (</w:t>
       </w:r>
       <w:r>
         <w:rPr>
@@ -23361,13 +23822,13 @@
           <w:bCs w:val="1"/>
           <w:rtl w:val="0"/>
         </w:rPr>
-        <w:t xml:space="preserve">RQNF04</w:t>
-      </w:r>
-      <w:r>
-        <w:rPr>
-          <w:rtl w:val="0"/>
-        </w:rPr>
-        <w:t xml:space="preserve">). Modos de ingesta: /api/detect (imagen JPEG), /api/video (MP4/AVI), /api/frame (JPEG del navegador), /api/stream (MJPEG del servidor).</w:t>
+        <w:t>RQNF04</w:t>
+      </w:r>
+      <w:r>
+        <w:rPr>
+          <w:rtl w:val="0"/>
+        </w:rPr>
+        <w:t>, ver nota). Modos de ingesta: /api/detect (imagen), /api/video (MP4/AVI, todos los fotogramas), /api/frame (JPEG del navegador) y /api/stream (cámara del servidor o IP RTSP).</w:t>
       </w:r>
     </w:p>
     <w:p>
@@ -23768,7 +24229,7 @@
         <w:rPr>
           <w:rtl w:val="0"/>
         </w:rPr>
-        <w:t xml:space="preserve"> Empaquetado de los datos del incidente y registro inalterable en el historial auditable de eventos (alertas.jsonl + fotograma anotado en outputs/alerts/&lt;AAAA-MM-DD&gt;/, conforme a </w:t>
+        <w:t xml:space="preserve"> Empaquetado de los datos del incidente y registro append-only en el historial auditable de eventos (alertas.jsonl + fotograma anotado en outputs/alerts/&lt;AAAA-MM-DD&gt;/, conforme a </w:t>
       </w:r>
       <w:r>
         <w:rPr>
@@ -23835,7 +24296,7 @@
         <w:rPr>
           <w:rtl w:val="0"/>
         </w:rPr>
-        <w:t xml:space="preserve">). El panel muestra estado operativo (OPERATIVO / DEGRADADO / NO OPERATIVO), refresco cada 3 s, y autenticación por PANEL_TOKEN (RQNF19).</w:t>
+        <w:t>). El panel muestra el estado operativo (OPERATIVO / DEGRADADO) durante el análisis, refresca el historial de alertas cada 3 s y se protege con PANEL_TOKEN (RQNF19).</w:t>
       </w:r>
     </w:p>
     <w:p>
@@ -26791,6 +27252,2252 @@
         <w:t>todos los umbrales, cadencias, modelos y la fuente de cámara están en configs/app.yaml; los modelos se verifican con SHA-256; la instalación se hace siempre en un entorno virtual (estándar o Lambda Stack) con scripts/setup.sh; hay pruebas automáticas unitarias y de la API completa.</w:t>
       </w:r>
     </w:p>
+    <w:p>
+      <w:pPr>
+        <w:widowControl w:val="0"/>
+        <w:spacing w:line="240" w:lineRule="auto"/>
+        <w:rPr/>
+      </w:pPr>
+      <w:r>
+        <w:rPr>
+          <w:rtl w:val="0"/>
+        </w:rPr>
+        <w:t>APÉNDICE E - Estado real de cumplimiento (versión de exposición)</w:t>
+      </w:r>
+    </w:p>
+    <w:p>
+      <w:pPr>
+        <w:widowControl w:val="0"/>
+        <w:spacing w:line="240" w:lineRule="auto"/>
+        <w:rPr/>
+      </w:pPr>
+      <w:r>
+        <w:rPr>
+          <w:rtl w:val="0"/>
+        </w:rPr>
+        <w:t>Resumen verificado sobre el sistema en ejecución (RTX 5070 Laptop, rama expo). «Parcial» indica que el requisito se cubre solo en parte; «Desviación» que se implementó de otra forma por una razón medida y documentada.</w:t>
+      </w:r>
+    </w:p>
+    <w:tbl>
+      <w:tblPr>
+        <w:tblStyle w:val="Table38"/>
+        <w:tblW w:w="9000.0" w:type="dxa"/>
+        <w:jc w:val="center"/>
+        <w:tblBorders>
+          <w:top w:color="cccccc" w:space="0" w:sz="8" w:val="single"/>
+          <w:left w:color="cccccc" w:space="0" w:sz="8" w:val="single"/>
+          <w:bottom w:color="cccccc" w:space="0" w:sz="8" w:val="single"/>
+          <w:right w:color="cccccc" w:space="0" w:sz="8" w:val="single"/>
+          <w:insideH w:color="cccccc" w:space="0" w:sz="8" w:val="single"/>
+          <w:insideV w:color="cccccc" w:space="0" w:sz="8" w:val="single"/>
+        </w:tblBorders>
+        <w:tblLayout w:type="fixed"/>
+        <w:tblLook w:val="0600"/>
+      </w:tblPr>
+      <w:tblGrid>
+        <w:gridCol w:w="1300"/>
+        <w:gridCol w:w="3000"/>
+        <w:gridCol w:w="2700"/>
+        <w:gridCol w:w="2000"/>
+        <w:tblGridChange w:id="0">
+          <w:tblGrid>
+            <w:gridCol w:w="1300"/>
+            <w:gridCol w:w="3000"/>
+            <w:gridCol w:w="2700"/>
+            <w:gridCol w:w="2000"/>
+          </w:tblGrid>
+        </w:tblGridChange>
+      </w:tblGrid>
+      <w:tr>
+        <w:trPr>
+          <w:cantSplit w:val="0"/>
+          <w:tblHeader w:val="1"/>
+        </w:trPr>
+        <w:tc>
+          <w:tcPr>
+            <w:tcBorders>
+              <w:bottom w:color="000000" w:space="0" w:sz="12" w:val="single"/>
+            </w:tcBorders>
+            <w:shd w:fill="f3f3f3" w:val="clear"/>
+          </w:tcPr>
+          <w:p>
+            <w:pPr>
+              <w:spacing w:line="276" w:lineRule="auto"/>
+              <w:jc w:val="center"/>
+              <w:rPr/>
+            </w:pPr>
+            <w:r>
+              <w:rPr>
+                <w:b w:val="1"/>
+                <w:bCs w:val="1"/>
+                <w:rtl w:val="0"/>
+              </w:rPr>
+              <w:t>Código</w:t>
+            </w:r>
+            <w:r>
+              <w:rPr>
+                <w:rtl w:val="0"/>
+              </w:rPr>
+            </w:r>
+          </w:p>
+        </w:tc>
+        <w:tc>
+          <w:tcPr>
+            <w:tcBorders>
+              <w:bottom w:color="000000" w:space="0" w:sz="12" w:val="single"/>
+            </w:tcBorders>
+            <w:shd w:fill="f3f3f3" w:val="clear"/>
+          </w:tcPr>
+          <w:p>
+            <w:pPr>
+              <w:spacing w:line="276" w:lineRule="auto"/>
+              <w:rPr/>
+            </w:pPr>
+            <w:r>
+              <w:rPr>
+                <w:b w:val="1"/>
+                <w:bCs w:val="1"/>
+                <w:rtl w:val="0"/>
+              </w:rPr>
+              <w:t>Estado</w:t>
+            </w:r>
+            <w:r>
+              <w:rPr>
+                <w:rtl w:val="0"/>
+              </w:rPr>
+            </w:r>
+          </w:p>
+        </w:tc>
+        <w:tc>
+          <w:tcPr>
+            <w:gridSpan w:val="2"/>
+            <w:tcBorders>
+              <w:bottom w:color="000000" w:space="0" w:sz="12" w:val="single"/>
+            </w:tcBorders>
+            <w:shd w:fill="f3f3f3" w:val="clear"/>
+          </w:tcPr>
+          <w:p>
+            <w:pPr>
+              <w:spacing w:line="276" w:lineRule="auto"/>
+              <w:rPr/>
+            </w:pPr>
+            <w:r>
+              <w:rPr>
+                <w:b w:val="1"/>
+                <w:bCs w:val="1"/>
+                <w:rtl w:val="0"/>
+              </w:rPr>
+              <w:t>Observación</w:t>
+            </w:r>
+            <w:r>
+              <w:rPr>
+                <w:rtl w:val="0"/>
+              </w:rPr>
+            </w:r>
+          </w:p>
+        </w:tc>
+      </w:tr>
+      <w:tr>
+        <w:trPr>
+          <w:cantSplit w:val="0"/>
+          <w:tblHeader w:val="0"/>
+        </w:trPr>
+        <w:tc>
+          <w:tcPr/>
+          <w:p>
+            <w:pPr>
+              <w:spacing w:line="276" w:lineRule="auto"/>
+              <w:rPr/>
+            </w:pPr>
+            <w:r>
+              <w:rPr>
+                <w:b w:val="1"/>
+                <w:bCs w:val="1"/>
+                <w:rtl w:val="0"/>
+              </w:rPr>
+              <w:t>RQF01</w:t>
+            </w:r>
+            <w:r>
+              <w:rPr>
+                <w:rtl w:val="0"/>
+              </w:rPr>
+            </w:r>
+          </w:p>
+        </w:tc>
+        <w:tc>
+          <w:tcPr/>
+          <w:p>
+            <w:pPr>
+              <w:spacing w:line="276" w:lineRule="auto"/>
+              <w:rPr/>
+            </w:pPr>
+            <w:r>
+              <w:rPr>
+                <w:rtl w:val="0"/>
+              </w:rPr>
+              <w:t>Cumple</w:t>
+            </w:r>
+          </w:p>
+        </w:tc>
+        <w:tc>
+          <w:tcPr>
+            <w:gridSpan w:val="2"/>
+          </w:tcPr>
+          <w:p>
+            <w:pPr>
+              <w:spacing w:line="276" w:lineRule="auto"/>
+              <w:rPr/>
+            </w:pPr>
+            <w:r>
+              <w:rPr>
+                <w:rtl w:val="0"/>
+              </w:rPr>
+              <w:t>Webcam del navegador y cámara IP/USB.</w:t>
+            </w:r>
+          </w:p>
+        </w:tc>
+      </w:tr>
+      <w:tr>
+        <w:trPr>
+          <w:cantSplit w:val="0"/>
+          <w:tblHeader w:val="0"/>
+        </w:trPr>
+        <w:tc>
+          <w:tcPr/>
+          <w:p>
+            <w:pPr>
+              <w:spacing w:line="276" w:lineRule="auto"/>
+              <w:rPr/>
+            </w:pPr>
+            <w:r>
+              <w:rPr>
+                <w:b w:val="1"/>
+                <w:bCs w:val="1"/>
+                <w:rtl w:val="0"/>
+              </w:rPr>
+              <w:t>RQF02</w:t>
+            </w:r>
+            <w:r>
+              <w:rPr>
+                <w:rtl w:val="0"/>
+              </w:rPr>
+            </w:r>
+          </w:p>
+        </w:tc>
+        <w:tc>
+          <w:tcPr/>
+          <w:p>
+            <w:pPr>
+              <w:spacing w:line="276" w:lineRule="auto"/>
+              <w:rPr/>
+            </w:pPr>
+            <w:r>
+              <w:rPr>
+                <w:rtl w:val="0"/>
+              </w:rPr>
+              <w:t>Cumple</w:t>
+            </w:r>
+          </w:p>
+        </w:tc>
+        <w:tc>
+          <w:tcPr>
+            <w:gridSpan w:val="2"/>
+          </w:tcPr>
+          <w:p>
+            <w:pPr>
+              <w:spacing w:line="276" w:lineRule="auto"/>
+              <w:rPr/>
+            </w:pPr>
+            <w:r>
+              <w:rPr>
+                <w:rtl w:val="0"/>
+              </w:rPr>
+              <w:t>4 categorías; (2) y (3) sin medición cuantitativa.</w:t>
+            </w:r>
+          </w:p>
+        </w:tc>
+      </w:tr>
+      <w:tr>
+        <w:trPr>
+          <w:cantSplit w:val="0"/>
+          <w:tblHeader w:val="0"/>
+        </w:trPr>
+        <w:tc>
+          <w:tcPr/>
+          <w:p>
+            <w:pPr>
+              <w:spacing w:line="276" w:lineRule="auto"/>
+              <w:rPr/>
+            </w:pPr>
+            <w:r>
+              <w:rPr>
+                <w:b w:val="1"/>
+                <w:bCs w:val="1"/>
+                <w:rtl w:val="0"/>
+              </w:rPr>
+              <w:t>RQF03</w:t>
+            </w:r>
+            <w:r>
+              <w:rPr>
+                <w:rtl w:val="0"/>
+              </w:rPr>
+            </w:r>
+          </w:p>
+        </w:tc>
+        <w:tc>
+          <w:tcPr/>
+          <w:p>
+            <w:pPr>
+              <w:spacing w:line="276" w:lineRule="auto"/>
+              <w:rPr/>
+            </w:pPr>
+            <w:r>
+              <w:rPr>
+                <w:rtl w:val="0"/>
+              </w:rPr>
+              <w:t>Cumple</w:t>
+            </w:r>
+          </w:p>
+        </w:tc>
+        <w:tc>
+          <w:tcPr>
+            <w:gridSpan w:val="2"/>
+          </w:tcPr>
+          <w:p>
+            <w:pPr>
+              <w:spacing w:line="276" w:lineRule="auto"/>
+              <w:rPr/>
+            </w:pPr>
+            <w:r>
+              <w:rPr>
+                <w:rtl w:val="0"/>
+              </w:rPr>
+              <w:t>BAJO / MEDIO / ALTO por persona.</w:t>
+            </w:r>
+          </w:p>
+        </w:tc>
+      </w:tr>
+      <w:tr>
+        <w:trPr>
+          <w:cantSplit w:val="0"/>
+          <w:tblHeader w:val="0"/>
+        </w:trPr>
+        <w:tc>
+          <w:tcPr/>
+          <w:p>
+            <w:pPr>
+              <w:spacing w:line="276" w:lineRule="auto"/>
+              <w:rPr/>
+            </w:pPr>
+            <w:r>
+              <w:rPr>
+                <w:b w:val="1"/>
+                <w:bCs w:val="1"/>
+                <w:rtl w:val="0"/>
+              </w:rPr>
+              <w:t>RQF04</w:t>
+            </w:r>
+            <w:r>
+              <w:rPr>
+                <w:rtl w:val="0"/>
+              </w:rPr>
+            </w:r>
+          </w:p>
+        </w:tc>
+        <w:tc>
+          <w:tcPr/>
+          <w:p>
+            <w:pPr>
+              <w:spacing w:line="276" w:lineRule="auto"/>
+              <w:rPr/>
+            </w:pPr>
+            <w:r>
+              <w:rPr>
+                <w:rtl w:val="0"/>
+              </w:rPr>
+              <w:t>Desviación</w:t>
+            </w:r>
+          </w:p>
+        </w:tc>
+        <w:tc>
+          <w:tcPr>
+            <w:gridSpan w:val="2"/>
+          </w:tcPr>
+          <w:p>
+            <w:pPr>
+              <w:spacing w:line="276" w:lineRule="auto"/>
+              <w:rPr/>
+            </w:pPr>
+            <w:r>
+              <w:rPr>
+                <w:rtl w:val="0"/>
+              </w:rPr>
+              <w:t>Puerta de alerta 0.35 (0.75 no disparaba nunca).</w:t>
+            </w:r>
+          </w:p>
+        </w:tc>
+      </w:tr>
+      <w:tr>
+        <w:trPr>
+          <w:cantSplit w:val="0"/>
+          <w:tblHeader w:val="0"/>
+        </w:trPr>
+        <w:tc>
+          <w:tcPr/>
+          <w:p>
+            <w:pPr>
+              <w:spacing w:line="276" w:lineRule="auto"/>
+              <w:rPr/>
+            </w:pPr>
+            <w:r>
+              <w:rPr>
+                <w:b w:val="1"/>
+                <w:bCs w:val="1"/>
+                <w:rtl w:val="0"/>
+              </w:rPr>
+              <w:t>RQF05</w:t>
+            </w:r>
+            <w:r>
+              <w:rPr>
+                <w:rtl w:val="0"/>
+              </w:rPr>
+            </w:r>
+          </w:p>
+        </w:tc>
+        <w:tc>
+          <w:tcPr/>
+          <w:p>
+            <w:pPr>
+              <w:spacing w:line="276" w:lineRule="auto"/>
+              <w:rPr/>
+            </w:pPr>
+            <w:r>
+              <w:rPr>
+                <w:rtl w:val="0"/>
+              </w:rPr>
+              <w:t>Cumple</w:t>
+            </w:r>
+          </w:p>
+        </w:tc>
+        <w:tc>
+          <w:tcPr>
+            <w:gridSpan w:val="2"/>
+          </w:tcPr>
+          <w:p>
+            <w:pPr>
+              <w:spacing w:line="276" w:lineRule="auto"/>
+              <w:rPr/>
+            </w:pPr>
+            <w:r>
+              <w:rPr>
+                <w:rtl w:val="0"/>
+              </w:rPr>
+              <w:t>IoU &gt; 0.25, oclusión 1 s.</w:t>
+            </w:r>
+          </w:p>
+        </w:tc>
+      </w:tr>
+      <w:tr>
+        <w:trPr>
+          <w:cantSplit w:val="0"/>
+          <w:tblHeader w:val="0"/>
+        </w:trPr>
+        <w:tc>
+          <w:tcPr/>
+          <w:p>
+            <w:pPr>
+              <w:spacing w:line="276" w:lineRule="auto"/>
+              <w:rPr/>
+            </w:pPr>
+            <w:r>
+              <w:rPr>
+                <w:b w:val="1"/>
+                <w:bCs w:val="1"/>
+                <w:rtl w:val="0"/>
+              </w:rPr>
+              <w:t>RQF06</w:t>
+            </w:r>
+            <w:r>
+              <w:rPr>
+                <w:rtl w:val="0"/>
+              </w:rPr>
+            </w:r>
+          </w:p>
+        </w:tc>
+        <w:tc>
+          <w:tcPr/>
+          <w:p>
+            <w:pPr>
+              <w:spacing w:line="276" w:lineRule="auto"/>
+              <w:rPr/>
+            </w:pPr>
+            <w:r>
+              <w:rPr>
+                <w:rtl w:val="0"/>
+              </w:rPr>
+              <w:t>Desviación</w:t>
+            </w:r>
+          </w:p>
+        </w:tc>
+        <w:tc>
+          <w:tcPr>
+            <w:gridSpan w:val="2"/>
+          </w:tcPr>
+          <w:p>
+            <w:pPr>
+              <w:spacing w:line="276" w:lineRule="auto"/>
+              <w:rPr/>
+            </w:pPr>
+            <w:r>
+              <w:rPr>
+                <w:rtl w:val="0"/>
+              </w:rPr>
+              <w:t>ALTO 1.2 s también para caídas; MEDIO 0.6 s.</w:t>
+            </w:r>
+          </w:p>
+        </w:tc>
+      </w:tr>
+      <w:tr>
+        <w:trPr>
+          <w:cantSplit w:val="0"/>
+          <w:tblHeader w:val="0"/>
+        </w:trPr>
+        <w:tc>
+          <w:tcPr/>
+          <w:p>
+            <w:pPr>
+              <w:spacing w:line="276" w:lineRule="auto"/>
+              <w:rPr/>
+            </w:pPr>
+            <w:r>
+              <w:rPr>
+                <w:b w:val="1"/>
+                <w:bCs w:val="1"/>
+                <w:rtl w:val="0"/>
+              </w:rPr>
+              <w:t>RQF07</w:t>
+            </w:r>
+            <w:r>
+              <w:rPr>
+                <w:rtl w:val="0"/>
+              </w:rPr>
+            </w:r>
+          </w:p>
+        </w:tc>
+        <w:tc>
+          <w:tcPr/>
+          <w:p>
+            <w:pPr>
+              <w:spacing w:line="276" w:lineRule="auto"/>
+              <w:rPr/>
+            </w:pPr>
+            <w:r>
+              <w:rPr>
+                <w:rtl w:val="0"/>
+              </w:rPr>
+              <w:t>Parcial</w:t>
+            </w:r>
+          </w:p>
+        </w:tc>
+        <w:tc>
+          <w:tcPr>
+            <w:gridSpan w:val="2"/>
+          </w:tcPr>
+          <w:p>
+            <w:pPr>
+              <w:spacing w:line="276" w:lineRule="auto"/>
+              <w:rPr/>
+            </w:pPr>
+            <w:r>
+              <w:rPr>
+                <w:rtl w:val="0"/>
+              </w:rPr>
+              <w:t>Sin ubicación de cámara en la alerta.</w:t>
+            </w:r>
+          </w:p>
+        </w:tc>
+      </w:tr>
+      <w:tr>
+        <w:trPr>
+          <w:cantSplit w:val="0"/>
+          <w:tblHeader w:val="0"/>
+        </w:trPr>
+        <w:tc>
+          <w:tcPr/>
+          <w:p>
+            <w:pPr>
+              <w:spacing w:line="276" w:lineRule="auto"/>
+              <w:rPr/>
+            </w:pPr>
+            <w:r>
+              <w:rPr>
+                <w:b w:val="1"/>
+                <w:bCs w:val="1"/>
+                <w:rtl w:val="0"/>
+              </w:rPr>
+              <w:t>RQF08</w:t>
+            </w:r>
+            <w:r>
+              <w:rPr>
+                <w:rtl w:val="0"/>
+              </w:rPr>
+            </w:r>
+          </w:p>
+        </w:tc>
+        <w:tc>
+          <w:tcPr/>
+          <w:p>
+            <w:pPr>
+              <w:spacing w:line="276" w:lineRule="auto"/>
+              <w:rPr/>
+            </w:pPr>
+            <w:r>
+              <w:rPr>
+                <w:rtl w:val="0"/>
+              </w:rPr>
+              <w:t>Parcial</w:t>
+            </w:r>
+          </w:p>
+        </w:tc>
+        <w:tc>
+          <w:tcPr>
+            <w:gridSpan w:val="2"/>
+          </w:tcPr>
+          <w:p>
+            <w:pPr>
+              <w:spacing w:line="276" w:lineRule="auto"/>
+              <w:rPr/>
+            </w:pPr>
+            <w:r>
+              <w:rPr>
+                <w:rtl w:val="0"/>
+              </w:rPr>
+              <w:t>Panel completo salvo la cámara de origen.</w:t>
+            </w:r>
+          </w:p>
+        </w:tc>
+      </w:tr>
+      <w:tr>
+        <w:trPr>
+          <w:cantSplit w:val="0"/>
+          <w:tblHeader w:val="0"/>
+        </w:trPr>
+        <w:tc>
+          <w:tcPr/>
+          <w:p>
+            <w:pPr>
+              <w:spacing w:line="276" w:lineRule="auto"/>
+              <w:rPr/>
+            </w:pPr>
+            <w:r>
+              <w:rPr>
+                <w:b w:val="1"/>
+                <w:bCs w:val="1"/>
+                <w:rtl w:val="0"/>
+              </w:rPr>
+              <w:t>RQNF01</w:t>
+            </w:r>
+            <w:r>
+              <w:rPr>
+                <w:rtl w:val="0"/>
+              </w:rPr>
+            </w:r>
+          </w:p>
+        </w:tc>
+        <w:tc>
+          <w:tcPr/>
+          <w:p>
+            <w:pPr>
+              <w:spacing w:line="276" w:lineRule="auto"/>
+              <w:rPr/>
+            </w:pPr>
+            <w:r>
+              <w:rPr>
+                <w:rtl w:val="0"/>
+              </w:rPr>
+              <w:t>Cumple (GPU)</w:t>
+            </w:r>
+          </w:p>
+        </w:tc>
+        <w:tc>
+          <w:tcPr>
+            <w:gridSpan w:val="2"/>
+          </w:tcPr>
+          <w:p>
+            <w:pPr>
+              <w:spacing w:line="276" w:lineRule="auto"/>
+              <w:rPr/>
+            </w:pPr>
+            <w:r>
+              <w:rPr>
+                <w:rtl w:val="0"/>
+              </w:rPr>
+              <w:t>34 FPS medidos; ~7 FPS en CPU.</w:t>
+            </w:r>
+          </w:p>
+        </w:tc>
+      </w:tr>
+      <w:tr>
+        <w:trPr>
+          <w:cantSplit w:val="0"/>
+          <w:tblHeader w:val="0"/>
+        </w:trPr>
+        <w:tc>
+          <w:tcPr/>
+          <w:p>
+            <w:pPr>
+              <w:spacing w:line="276" w:lineRule="auto"/>
+              <w:rPr/>
+            </w:pPr>
+            <w:r>
+              <w:rPr>
+                <w:b w:val="1"/>
+                <w:bCs w:val="1"/>
+                <w:rtl w:val="0"/>
+              </w:rPr>
+              <w:t>RQNF02</w:t>
+            </w:r>
+            <w:r>
+              <w:rPr>
+                <w:rtl w:val="0"/>
+              </w:rPr>
+            </w:r>
+          </w:p>
+        </w:tc>
+        <w:tc>
+          <w:tcPr/>
+          <w:p>
+            <w:pPr>
+              <w:spacing w:line="276" w:lineRule="auto"/>
+              <w:rPr/>
+            </w:pPr>
+            <w:r>
+              <w:rPr>
+                <w:rtl w:val="0"/>
+              </w:rPr>
+              <w:t>Cumple</w:t>
+            </w:r>
+          </w:p>
+        </w:tc>
+        <w:tc>
+          <w:tcPr>
+            <w:gridSpan w:val="2"/>
+          </w:tcPr>
+          <w:p>
+            <w:pPr>
+              <w:spacing w:line="276" w:lineRule="auto"/>
+              <w:rPr/>
+            </w:pPr>
+            <w:r>
+              <w:rPr>
+                <w:rtl w:val="0"/>
+              </w:rPr>
+              <w:t>4-5 ms por petición en vivo.</w:t>
+            </w:r>
+          </w:p>
+        </w:tc>
+      </w:tr>
+      <w:tr>
+        <w:trPr>
+          <w:cantSplit w:val="0"/>
+          <w:tblHeader w:val="0"/>
+        </w:trPr>
+        <w:tc>
+          <w:tcPr/>
+          <w:p>
+            <w:pPr>
+              <w:spacing w:line="276" w:lineRule="auto"/>
+              <w:rPr/>
+            </w:pPr>
+            <w:r>
+              <w:rPr>
+                <w:b w:val="1"/>
+                <w:bCs w:val="1"/>
+                <w:rtl w:val="0"/>
+              </w:rPr>
+              <w:t>RQNF03</w:t>
+            </w:r>
+            <w:r>
+              <w:rPr>
+                <w:rtl w:val="0"/>
+              </w:rPr>
+            </w:r>
+          </w:p>
+        </w:tc>
+        <w:tc>
+          <w:tcPr/>
+          <w:p>
+            <w:pPr>
+              <w:spacing w:line="276" w:lineRule="auto"/>
+              <w:rPr/>
+            </w:pPr>
+            <w:r>
+              <w:rPr>
+                <w:rtl w:val="0"/>
+              </w:rPr>
+              <w:t>Cumple</w:t>
+            </w:r>
+          </w:p>
+        </w:tc>
+        <w:tc>
+          <w:tcPr>
+            <w:gridSpan w:val="2"/>
+          </w:tcPr>
+          <w:p>
+            <w:pPr>
+              <w:spacing w:line="276" w:lineRule="auto"/>
+              <w:rPr/>
+            </w:pPr>
+            <w:r>
+              <w:rPr>
+                <w:rtl w:val="0"/>
+              </w:rPr>
+              <w:t>8 GB VRAM verificados (check_env).</w:t>
+            </w:r>
+          </w:p>
+        </w:tc>
+      </w:tr>
+      <w:tr>
+        <w:trPr>
+          <w:cantSplit w:val="0"/>
+          <w:tblHeader w:val="0"/>
+        </w:trPr>
+        <w:tc>
+          <w:tcPr/>
+          <w:p>
+            <w:pPr>
+              <w:spacing w:line="276" w:lineRule="auto"/>
+              <w:rPr/>
+            </w:pPr>
+            <w:r>
+              <w:rPr>
+                <w:b w:val="1"/>
+                <w:bCs w:val="1"/>
+                <w:rtl w:val="0"/>
+              </w:rPr>
+              <w:t>RQNF04</w:t>
+            </w:r>
+            <w:r>
+              <w:rPr>
+                <w:rtl w:val="0"/>
+              </w:rPr>
+            </w:r>
+          </w:p>
+        </w:tc>
+        <w:tc>
+          <w:tcPr/>
+          <w:p>
+            <w:pPr>
+              <w:spacing w:line="276" w:lineRule="auto"/>
+              <w:rPr/>
+            </w:pPr>
+            <w:r>
+              <w:rPr>
+                <w:rtl w:val="0"/>
+              </w:rPr>
+              <w:t>Desviación</w:t>
+            </w:r>
+          </w:p>
+        </w:tc>
+        <w:tc>
+          <w:tcPr>
+            <w:gridSpan w:val="2"/>
+          </w:tcPr>
+          <w:p>
+            <w:pPr>
+              <w:spacing w:line="276" w:lineRule="auto"/>
+              <w:rPr/>
+            </w:pPr>
+            <w:r>
+              <w:rPr>
+                <w:rtl w:val="0"/>
+              </w:rPr>
+              <w:t>En vivo se descartan fotogramas atrasados.</w:t>
+            </w:r>
+          </w:p>
+        </w:tc>
+      </w:tr>
+      <w:tr>
+        <w:trPr>
+          <w:cantSplit w:val="0"/>
+          <w:tblHeader w:val="0"/>
+        </w:trPr>
+        <w:tc>
+          <w:tcPr/>
+          <w:p>
+            <w:pPr>
+              <w:spacing w:line="276" w:lineRule="auto"/>
+              <w:rPr/>
+            </w:pPr>
+            <w:r>
+              <w:rPr>
+                <w:b w:val="1"/>
+                <w:bCs w:val="1"/>
+                <w:rtl w:val="0"/>
+              </w:rPr>
+              <w:t>RQNF05</w:t>
+            </w:r>
+            <w:r>
+              <w:rPr>
+                <w:rtl w:val="0"/>
+              </w:rPr>
+            </w:r>
+          </w:p>
+        </w:tc>
+        <w:tc>
+          <w:tcPr/>
+          <w:p>
+            <w:pPr>
+              <w:spacing w:line="276" w:lineRule="auto"/>
+              <w:rPr/>
+            </w:pPr>
+            <w:r>
+              <w:rPr>
+                <w:rtl w:val="0"/>
+              </w:rPr>
+              <w:t>Cumple</w:t>
+            </w:r>
+          </w:p>
+        </w:tc>
+        <w:tc>
+          <w:tcPr>
+            <w:gridSpan w:val="2"/>
+          </w:tcPr>
+          <w:p>
+            <w:pPr>
+              <w:spacing w:line="276" w:lineRule="auto"/>
+              <w:rPr/>
+            </w:pPr>
+            <w:r>
+              <w:rPr>
+                <w:rtl w:val="0"/>
+              </w:rPr>
+              <w:t>Hilos propios, panel asíncrono.</w:t>
+            </w:r>
+          </w:p>
+        </w:tc>
+      </w:tr>
+      <w:tr>
+        <w:trPr>
+          <w:cantSplit w:val="0"/>
+          <w:tblHeader w:val="0"/>
+        </w:trPr>
+        <w:tc>
+          <w:tcPr/>
+          <w:p>
+            <w:pPr>
+              <w:spacing w:line="276" w:lineRule="auto"/>
+              <w:rPr/>
+            </w:pPr>
+            <w:r>
+              <w:rPr>
+                <w:b w:val="1"/>
+                <w:bCs w:val="1"/>
+                <w:rtl w:val="0"/>
+              </w:rPr>
+              <w:t>RQNF06</w:t>
+            </w:r>
+            <w:r>
+              <w:rPr>
+                <w:rtl w:val="0"/>
+              </w:rPr>
+            </w:r>
+          </w:p>
+        </w:tc>
+        <w:tc>
+          <w:tcPr/>
+          <w:p>
+            <w:pPr>
+              <w:spacing w:line="276" w:lineRule="auto"/>
+              <w:rPr/>
+            </w:pPr>
+            <w:r>
+              <w:rPr>
+                <w:rtl w:val="0"/>
+              </w:rPr>
+              <w:t>Parcial</w:t>
+            </w:r>
+          </w:p>
+        </w:tc>
+        <w:tc>
+          <w:tcPr>
+            <w:gridSpan w:val="2"/>
+          </w:tcPr>
+          <w:p>
+            <w:pPr>
+              <w:spacing w:line="276" w:lineRule="auto"/>
+              <w:rPr/>
+            </w:pPr>
+            <w:r>
+              <w:rPr>
+                <w:rtl w:val="0"/>
+              </w:rPr>
+              <w:t>Bloque de alerta sin cámara de origen.</w:t>
+            </w:r>
+          </w:p>
+        </w:tc>
+      </w:tr>
+      <w:tr>
+        <w:trPr>
+          <w:cantSplit w:val="0"/>
+          <w:tblHeader w:val="0"/>
+        </w:trPr>
+        <w:tc>
+          <w:tcPr/>
+          <w:p>
+            <w:pPr>
+              <w:spacing w:line="276" w:lineRule="auto"/>
+              <w:rPr/>
+            </w:pPr>
+            <w:r>
+              <w:rPr>
+                <w:b w:val="1"/>
+                <w:bCs w:val="1"/>
+                <w:rtl w:val="0"/>
+              </w:rPr>
+              <w:t>RQNF07</w:t>
+            </w:r>
+            <w:r>
+              <w:rPr>
+                <w:rtl w:val="0"/>
+              </w:rPr>
+            </w:r>
+          </w:p>
+        </w:tc>
+        <w:tc>
+          <w:tcPr/>
+          <w:p>
+            <w:pPr>
+              <w:spacing w:line="276" w:lineRule="auto"/>
+              <w:rPr/>
+            </w:pPr>
+            <w:r>
+              <w:rPr>
+                <w:rtl w:val="0"/>
+              </w:rPr>
+              <w:t>No verificado</w:t>
+            </w:r>
+          </w:p>
+        </w:tc>
+        <w:tc>
+          <w:tcPr>
+            <w:gridSpan w:val="2"/>
+          </w:tcPr>
+          <w:p>
+            <w:pPr>
+              <w:spacing w:line="276" w:lineRule="auto"/>
+              <w:rPr/>
+            </w:pPr>
+            <w:r>
+              <w:rPr>
+                <w:rtl w:val="0"/>
+              </w:rPr>
+              <w:t>Sin pruebas con usuarios finales.</w:t>
+            </w:r>
+          </w:p>
+        </w:tc>
+      </w:tr>
+      <w:tr>
+        <w:trPr>
+          <w:cantSplit w:val="0"/>
+          <w:tblHeader w:val="0"/>
+        </w:trPr>
+        <w:tc>
+          <w:tcPr/>
+          <w:p>
+            <w:pPr>
+              <w:spacing w:line="276" w:lineRule="auto"/>
+              <w:rPr/>
+            </w:pPr>
+            <w:r>
+              <w:rPr>
+                <w:b w:val="1"/>
+                <w:bCs w:val="1"/>
+                <w:rtl w:val="0"/>
+              </w:rPr>
+              <w:t>RQNF08</w:t>
+            </w:r>
+            <w:r>
+              <w:rPr>
+                <w:rtl w:val="0"/>
+              </w:rPr>
+            </w:r>
+          </w:p>
+        </w:tc>
+        <w:tc>
+          <w:tcPr/>
+          <w:p>
+            <w:pPr>
+              <w:spacing w:line="276" w:lineRule="auto"/>
+              <w:rPr/>
+            </w:pPr>
+            <w:r>
+              <w:rPr>
+                <w:rtl w:val="0"/>
+              </w:rPr>
+              <w:t>Cumple</w:t>
+            </w:r>
+          </w:p>
+        </w:tc>
+        <w:tc>
+          <w:tcPr>
+            <w:gridSpan w:val="2"/>
+          </w:tcPr>
+          <w:p>
+            <w:pPr>
+              <w:spacing w:line="276" w:lineRule="auto"/>
+              <w:rPr/>
+            </w:pPr>
+            <w:r>
+              <w:rPr>
+                <w:rtl w:val="0"/>
+              </w:rPr>
+              <w:t>Rojo / ámbar / verde.</w:t>
+            </w:r>
+          </w:p>
+        </w:tc>
+      </w:tr>
+      <w:tr>
+        <w:trPr>
+          <w:cantSplit w:val="0"/>
+          <w:tblHeader w:val="0"/>
+        </w:trPr>
+        <w:tc>
+          <w:tcPr/>
+          <w:p>
+            <w:pPr>
+              <w:spacing w:line="276" w:lineRule="auto"/>
+              <w:rPr/>
+            </w:pPr>
+            <w:r>
+              <w:rPr>
+                <w:b w:val="1"/>
+                <w:bCs w:val="1"/>
+                <w:rtl w:val="0"/>
+              </w:rPr>
+              <w:t>RQNF09</w:t>
+            </w:r>
+            <w:r>
+              <w:rPr>
+                <w:rtl w:val="0"/>
+              </w:rPr>
+            </w:r>
+          </w:p>
+        </w:tc>
+        <w:tc>
+          <w:tcPr/>
+          <w:p>
+            <w:pPr>
+              <w:spacing w:line="276" w:lineRule="auto"/>
+              <w:rPr/>
+            </w:pPr>
+            <w:r>
+              <w:rPr>
+                <w:rtl w:val="0"/>
+              </w:rPr>
+              <w:t>Parcial</w:t>
+            </w:r>
+          </w:p>
+        </w:tc>
+        <w:tc>
+          <w:tcPr>
+            <w:gridSpan w:val="2"/>
+          </w:tcPr>
+          <w:p>
+            <w:pPr>
+              <w:spacing w:line="276" w:lineRule="auto"/>
+              <w:rPr/>
+            </w:pPr>
+            <w:r>
+              <w:rPr>
+                <w:rtl w:val="0"/>
+              </w:rPr>
+              <w:t>Estado visible durante el análisis.</w:t>
+            </w:r>
+          </w:p>
+        </w:tc>
+      </w:tr>
+      <w:tr>
+        <w:trPr>
+          <w:cantSplit w:val="0"/>
+          <w:tblHeader w:val="0"/>
+        </w:trPr>
+        <w:tc>
+          <w:tcPr/>
+          <w:p>
+            <w:pPr>
+              <w:spacing w:line="276" w:lineRule="auto"/>
+              <w:rPr/>
+            </w:pPr>
+            <w:r>
+              <w:rPr>
+                <w:b w:val="1"/>
+                <w:bCs w:val="1"/>
+                <w:rtl w:val="0"/>
+              </w:rPr>
+              <w:t>RQNF10</w:t>
+            </w:r>
+            <w:r>
+              <w:rPr>
+                <w:rtl w:val="0"/>
+              </w:rPr>
+            </w:r>
+          </w:p>
+        </w:tc>
+        <w:tc>
+          <w:tcPr/>
+          <w:p>
+            <w:pPr>
+              <w:spacing w:line="276" w:lineRule="auto"/>
+              <w:rPr/>
+            </w:pPr>
+            <w:r>
+              <w:rPr>
+                <w:rtl w:val="0"/>
+              </w:rPr>
+              <w:t>Cumple</w:t>
+            </w:r>
+          </w:p>
+        </w:tc>
+        <w:tc>
+          <w:tcPr>
+            <w:gridSpan w:val="2"/>
+          </w:tcPr>
+          <w:p>
+            <w:pPr>
+              <w:spacing w:line="276" w:lineRule="auto"/>
+              <w:rPr/>
+            </w:pPr>
+            <w:r>
+              <w:rPr>
+                <w:rtl w:val="0"/>
+              </w:rPr>
+              <w:t>mAP@0.5 0.776 (val) / 0.768 (test).</w:t>
+            </w:r>
+          </w:p>
+        </w:tc>
+      </w:tr>
+      <w:tr>
+        <w:trPr>
+          <w:cantSplit w:val="0"/>
+          <w:tblHeader w:val="0"/>
+        </w:trPr>
+        <w:tc>
+          <w:tcPr/>
+          <w:p>
+            <w:pPr>
+              <w:spacing w:line="276" w:lineRule="auto"/>
+              <w:rPr/>
+            </w:pPr>
+            <w:r>
+              <w:rPr>
+                <w:b w:val="1"/>
+                <w:bCs w:val="1"/>
+                <w:rtl w:val="0"/>
+              </w:rPr>
+              <w:t>RQNF11</w:t>
+            </w:r>
+            <w:r>
+              <w:rPr>
+                <w:rtl w:val="0"/>
+              </w:rPr>
+            </w:r>
+          </w:p>
+        </w:tc>
+        <w:tc>
+          <w:tcPr/>
+          <w:p>
+            <w:pPr>
+              <w:spacing w:line="276" w:lineRule="auto"/>
+              <w:rPr/>
+            </w:pPr>
+            <w:r>
+              <w:rPr>
+                <w:rtl w:val="0"/>
+              </w:rPr>
+              <w:t>Despliegue</w:t>
+            </w:r>
+          </w:p>
+        </w:tc>
+        <w:tc>
+          <w:tcPr>
+            <w:gridSpan w:val="2"/>
+          </w:tcPr>
+          <w:p>
+            <w:pPr>
+              <w:spacing w:line="276" w:lineRule="auto"/>
+              <w:rPr/>
+            </w:pPr>
+            <w:r>
+              <w:rPr>
+                <w:rtl w:val="0"/>
+              </w:rPr>
+              <w:t>Horario de funcionamiento.</w:t>
+            </w:r>
+          </w:p>
+        </w:tc>
+      </w:tr>
+      <w:tr>
+        <w:trPr>
+          <w:cantSplit w:val="0"/>
+          <w:tblHeader w:val="0"/>
+        </w:trPr>
+        <w:tc>
+          <w:tcPr/>
+          <w:p>
+            <w:pPr>
+              <w:spacing w:line="276" w:lineRule="auto"/>
+              <w:rPr/>
+            </w:pPr>
+            <w:r>
+              <w:rPr>
+                <w:b w:val="1"/>
+                <w:bCs w:val="1"/>
+                <w:rtl w:val="0"/>
+              </w:rPr>
+              <w:t>RQNF12</w:t>
+            </w:r>
+            <w:r>
+              <w:rPr>
+                <w:rtl w:val="0"/>
+              </w:rPr>
+            </w:r>
+          </w:p>
+        </w:tc>
+        <w:tc>
+          <w:tcPr/>
+          <w:p>
+            <w:pPr>
+              <w:spacing w:line="276" w:lineRule="auto"/>
+              <w:rPr/>
+            </w:pPr>
+            <w:r>
+              <w:rPr>
+                <w:rtl w:val="0"/>
+              </w:rPr>
+              <w:t>Parcial</w:t>
+            </w:r>
+          </w:p>
+        </w:tc>
+        <w:tc>
+          <w:tcPr>
+            <w:gridSpan w:val="2"/>
+          </w:tcPr>
+          <w:p>
+            <w:pPr>
+              <w:spacing w:line="276" w:lineRule="auto"/>
+              <w:rPr/>
+            </w:pPr>
+            <w:r>
+              <w:rPr>
+                <w:rtl w:val="0"/>
+              </w:rPr>
+              <w:t>Aumentos HSV; sin medición formal.</w:t>
+            </w:r>
+          </w:p>
+        </w:tc>
+      </w:tr>
+      <w:tr>
+        <w:trPr>
+          <w:cantSplit w:val="0"/>
+          <w:tblHeader w:val="0"/>
+        </w:trPr>
+        <w:tc>
+          <w:tcPr/>
+          <w:p>
+            <w:pPr>
+              <w:spacing w:line="276" w:lineRule="auto"/>
+              <w:rPr/>
+            </w:pPr>
+            <w:r>
+              <w:rPr>
+                <w:b w:val="1"/>
+                <w:bCs w:val="1"/>
+                <w:rtl w:val="0"/>
+              </w:rPr>
+              <w:t>RQNF13</w:t>
+            </w:r>
+            <w:r>
+              <w:rPr>
+                <w:rtl w:val="0"/>
+              </w:rPr>
+            </w:r>
+          </w:p>
+        </w:tc>
+        <w:tc>
+          <w:tcPr/>
+          <w:p>
+            <w:pPr>
+              <w:spacing w:line="276" w:lineRule="auto"/>
+              <w:rPr/>
+            </w:pPr>
+            <w:r>
+              <w:rPr>
+                <w:rtl w:val="0"/>
+              </w:rPr>
+              <w:t>Cumple</w:t>
+            </w:r>
+          </w:p>
+        </w:tc>
+        <w:tc>
+          <w:tcPr>
+            <w:gridSpan w:val="2"/>
+          </w:tcPr>
+          <w:p>
+            <w:pPr>
+              <w:spacing w:line="276" w:lineRule="auto"/>
+              <w:rPr/>
+            </w:pPr>
+            <w:r>
+              <w:rPr>
+                <w:rtl w:val="0"/>
+              </w:rPr>
+              <w:t>Reconexión de webcam y cámara IP.</w:t>
+            </w:r>
+          </w:p>
+        </w:tc>
+      </w:tr>
+      <w:tr>
+        <w:trPr>
+          <w:cantSplit w:val="0"/>
+          <w:tblHeader w:val="0"/>
+        </w:trPr>
+        <w:tc>
+          <w:tcPr/>
+          <w:p>
+            <w:pPr>
+              <w:spacing w:line="276" w:lineRule="auto"/>
+              <w:rPr/>
+            </w:pPr>
+            <w:r>
+              <w:rPr>
+                <w:b w:val="1"/>
+                <w:bCs w:val="1"/>
+                <w:rtl w:val="0"/>
+              </w:rPr>
+              <w:t>RQNF14</w:t>
+            </w:r>
+            <w:r>
+              <w:rPr>
+                <w:rtl w:val="0"/>
+              </w:rPr>
+            </w:r>
+          </w:p>
+        </w:tc>
+        <w:tc>
+          <w:tcPr/>
+          <w:p>
+            <w:pPr>
+              <w:spacing w:line="276" w:lineRule="auto"/>
+              <w:rPr/>
+            </w:pPr>
+            <w:r>
+              <w:rPr>
+                <w:rtl w:val="0"/>
+              </w:rPr>
+              <w:t>Parcial</w:t>
+            </w:r>
+          </w:p>
+        </w:tc>
+        <w:tc>
+          <w:tcPr>
+            <w:gridSpan w:val="2"/>
+          </w:tcPr>
+          <w:p>
+            <w:pPr>
+              <w:spacing w:line="276" w:lineRule="auto"/>
+              <w:rPr/>
+            </w:pPr>
+            <w:r>
+              <w:rPr>
+                <w:rtl w:val="0"/>
+              </w:rPr>
+              <w:t>Evidencia anonimizada; sin HTTPS.</w:t>
+            </w:r>
+          </w:p>
+        </w:tc>
+      </w:tr>
+      <w:tr>
+        <w:trPr>
+          <w:cantSplit w:val="0"/>
+          <w:tblHeader w:val="0"/>
+        </w:trPr>
+        <w:tc>
+          <w:tcPr/>
+          <w:p>
+            <w:pPr>
+              <w:spacing w:line="276" w:lineRule="auto"/>
+              <w:rPr/>
+            </w:pPr>
+            <w:r>
+              <w:rPr>
+                <w:b w:val="1"/>
+                <w:bCs w:val="1"/>
+                <w:rtl w:val="0"/>
+              </w:rPr>
+              <w:t>RQNF15</w:t>
+            </w:r>
+            <w:r>
+              <w:rPr>
+                <w:rtl w:val="0"/>
+              </w:rPr>
+            </w:r>
+          </w:p>
+        </w:tc>
+        <w:tc>
+          <w:tcPr/>
+          <w:p>
+            <w:pPr>
+              <w:spacing w:line="276" w:lineRule="auto"/>
+              <w:rPr/>
+            </w:pPr>
+            <w:r>
+              <w:rPr>
+                <w:rtl w:val="0"/>
+              </w:rPr>
+              <w:t>Parcial</w:t>
+            </w:r>
+          </w:p>
+        </w:tc>
+        <w:tc>
+          <w:tcPr>
+            <w:gridSpan w:val="2"/>
+          </w:tcPr>
+          <w:p>
+            <w:pPr>
+              <w:spacing w:line="276" w:lineRule="auto"/>
+              <w:rPr/>
+            </w:pPr>
+            <w:r>
+              <w:rPr>
+                <w:rtl w:val="0"/>
+              </w:rPr>
+              <w:t>Escritura conjunta; sin hash de integridad.</w:t>
+            </w:r>
+          </w:p>
+        </w:tc>
+      </w:tr>
+      <w:tr>
+        <w:trPr>
+          <w:cantSplit w:val="0"/>
+          <w:tblHeader w:val="0"/>
+        </w:trPr>
+        <w:tc>
+          <w:tcPr/>
+          <w:p>
+            <w:pPr>
+              <w:spacing w:line="276" w:lineRule="auto"/>
+              <w:rPr/>
+            </w:pPr>
+            <w:r>
+              <w:rPr>
+                <w:b w:val="1"/>
+                <w:bCs w:val="1"/>
+                <w:rtl w:val="0"/>
+              </w:rPr>
+              <w:t>RQNF16</w:t>
+            </w:r>
+            <w:r>
+              <w:rPr>
+                <w:rtl w:val="0"/>
+              </w:rPr>
+            </w:r>
+          </w:p>
+        </w:tc>
+        <w:tc>
+          <w:tcPr/>
+          <w:p>
+            <w:pPr>
+              <w:spacing w:line="276" w:lineRule="auto"/>
+              <w:rPr/>
+            </w:pPr>
+            <w:r>
+              <w:rPr>
+                <w:rtl w:val="0"/>
+              </w:rPr>
+              <w:t>Parcial</w:t>
+            </w:r>
+          </w:p>
+        </w:tc>
+        <w:tc>
+          <w:tcPr>
+            <w:gridSpan w:val="2"/>
+          </w:tcPr>
+          <w:p>
+            <w:pPr>
+              <w:spacing w:line="276" w:lineRule="auto"/>
+              <w:rPr/>
+            </w:pPr>
+            <w:r>
+              <w:rPr>
+                <w:rtl w:val="0"/>
+              </w:rPr>
+              <w:t>Registro append-only; sin cámara ni firma.</w:t>
+            </w:r>
+          </w:p>
+        </w:tc>
+      </w:tr>
+      <w:tr>
+        <w:trPr>
+          <w:cantSplit w:val="0"/>
+          <w:tblHeader w:val="0"/>
+        </w:trPr>
+        <w:tc>
+          <w:tcPr/>
+          <w:p>
+            <w:pPr>
+              <w:spacing w:line="276" w:lineRule="auto"/>
+              <w:rPr/>
+            </w:pPr>
+            <w:r>
+              <w:rPr>
+                <w:b w:val="1"/>
+                <w:bCs w:val="1"/>
+                <w:rtl w:val="0"/>
+              </w:rPr>
+              <w:t>RQNF17</w:t>
+            </w:r>
+            <w:r>
+              <w:rPr>
+                <w:rtl w:val="0"/>
+              </w:rPr>
+            </w:r>
+          </w:p>
+        </w:tc>
+        <w:tc>
+          <w:tcPr/>
+          <w:p>
+            <w:pPr>
+              <w:spacing w:line="276" w:lineRule="auto"/>
+              <w:rPr/>
+            </w:pPr>
+            <w:r>
+              <w:rPr>
+                <w:rtl w:val="0"/>
+              </w:rPr>
+              <w:t>Parcial</w:t>
+            </w:r>
+          </w:p>
+        </w:tc>
+        <w:tc>
+          <w:tcPr>
+            <w:gridSpan w:val="2"/>
+          </w:tcPr>
+          <w:p>
+            <w:pPr>
+              <w:spacing w:line="276" w:lineRule="auto"/>
+              <w:rPr/>
+            </w:pPr>
+            <w:r>
+              <w:rPr>
+                <w:rtl w:val="0"/>
+              </w:rPr>
+              <w:t>SHA-256 de pesos a demanda.</w:t>
+            </w:r>
+          </w:p>
+        </w:tc>
+      </w:tr>
+      <w:tr>
+        <w:trPr>
+          <w:cantSplit w:val="0"/>
+          <w:tblHeader w:val="0"/>
+        </w:trPr>
+        <w:tc>
+          <w:tcPr/>
+          <w:p>
+            <w:pPr>
+              <w:spacing w:line="276" w:lineRule="auto"/>
+              <w:rPr/>
+            </w:pPr>
+            <w:r>
+              <w:rPr>
+                <w:b w:val="1"/>
+                <w:bCs w:val="1"/>
+                <w:rtl w:val="0"/>
+              </w:rPr>
+              <w:t>RQNF18</w:t>
+            </w:r>
+            <w:r>
+              <w:rPr>
+                <w:rtl w:val="0"/>
+              </w:rPr>
+            </w:r>
+          </w:p>
+        </w:tc>
+        <w:tc>
+          <w:tcPr/>
+          <w:p>
+            <w:pPr>
+              <w:spacing w:line="276" w:lineRule="auto"/>
+              <w:rPr/>
+            </w:pPr>
+            <w:r>
+              <w:rPr>
+                <w:rtl w:val="0"/>
+              </w:rPr>
+              <w:t>Parcial</w:t>
+            </w:r>
+          </w:p>
+        </w:tc>
+        <w:tc>
+          <w:tcPr>
+            <w:gridSpan w:val="2"/>
+          </w:tcPr>
+          <w:p>
+            <w:pPr>
+              <w:spacing w:line="276" w:lineRule="auto"/>
+              <w:rPr/>
+            </w:pPr>
+            <w:r>
+              <w:rPr>
+                <w:rtl w:val="0"/>
+              </w:rPr>
+              <w:t>Vínculo por marca de tiempo; sin firma.</w:t>
+            </w:r>
+          </w:p>
+        </w:tc>
+      </w:tr>
+      <w:tr>
+        <w:trPr>
+          <w:cantSplit w:val="0"/>
+          <w:tblHeader w:val="0"/>
+        </w:trPr>
+        <w:tc>
+          <w:tcPr/>
+          <w:p>
+            <w:pPr>
+              <w:spacing w:line="276" w:lineRule="auto"/>
+              <w:rPr/>
+            </w:pPr>
+            <w:r>
+              <w:rPr>
+                <w:b w:val="1"/>
+                <w:bCs w:val="1"/>
+                <w:rtl w:val="0"/>
+              </w:rPr>
+              <w:t>RQNF19</w:t>
+            </w:r>
+            <w:r>
+              <w:rPr>
+                <w:rtl w:val="0"/>
+              </w:rPr>
+            </w:r>
+          </w:p>
+        </w:tc>
+        <w:tc>
+          <w:tcPr/>
+          <w:p>
+            <w:pPr>
+              <w:spacing w:line="276" w:lineRule="auto"/>
+              <w:rPr/>
+            </w:pPr>
+            <w:r>
+              <w:rPr>
+                <w:rtl w:val="0"/>
+              </w:rPr>
+              <w:t>Parcial</w:t>
+            </w:r>
+          </w:p>
+        </w:tc>
+        <w:tc>
+          <w:tcPr>
+            <w:gridSpan w:val="2"/>
+          </w:tcPr>
+          <w:p>
+            <w:pPr>
+              <w:spacing w:line="276" w:lineRule="auto"/>
+              <w:rPr/>
+            </w:pPr>
+            <w:r>
+              <w:rPr>
+                <w:rtl w:val="0"/>
+              </w:rPr>
+              <w:t>Token compartido, sin usuarios.</w:t>
+            </w:r>
+          </w:p>
+        </w:tc>
+      </w:tr>
+      <w:tr>
+        <w:trPr>
+          <w:cantSplit w:val="0"/>
+          <w:tblHeader w:val="0"/>
+        </w:trPr>
+        <w:tc>
+          <w:tcPr/>
+          <w:p>
+            <w:pPr>
+              <w:spacing w:line="276" w:lineRule="auto"/>
+              <w:rPr/>
+            </w:pPr>
+            <w:r>
+              <w:rPr>
+                <w:b w:val="1"/>
+                <w:bCs w:val="1"/>
+                <w:rtl w:val="0"/>
+              </w:rPr>
+              <w:t>RQNF20</w:t>
+            </w:r>
+            <w:r>
+              <w:rPr>
+                <w:rtl w:val="0"/>
+              </w:rPr>
+            </w:r>
+          </w:p>
+        </w:tc>
+        <w:tc>
+          <w:tcPr/>
+          <w:p>
+            <w:pPr>
+              <w:spacing w:line="276" w:lineRule="auto"/>
+              <w:rPr/>
+            </w:pPr>
+            <w:r>
+              <w:rPr>
+                <w:rtl w:val="0"/>
+              </w:rPr>
+              <w:t>Cumple</w:t>
+            </w:r>
+          </w:p>
+        </w:tc>
+        <w:tc>
+          <w:tcPr>
+            <w:gridSpan w:val="2"/>
+          </w:tcPr>
+          <w:p>
+            <w:pPr>
+              <w:spacing w:line="276" w:lineRule="auto"/>
+              <w:rPr/>
+            </w:pPr>
+            <w:r>
+              <w:rPr>
+                <w:rtl w:val="0"/>
+              </w:rPr>
+              <w:t>Arquitectura por capas.</w:t>
+            </w:r>
+          </w:p>
+        </w:tc>
+      </w:tr>
+      <w:tr>
+        <w:trPr>
+          <w:cantSplit w:val="0"/>
+          <w:tblHeader w:val="0"/>
+        </w:trPr>
+        <w:tc>
+          <w:tcPr/>
+          <w:p>
+            <w:pPr>
+              <w:spacing w:line="276" w:lineRule="auto"/>
+              <w:rPr/>
+            </w:pPr>
+            <w:r>
+              <w:rPr>
+                <w:b w:val="1"/>
+                <w:bCs w:val="1"/>
+                <w:rtl w:val="0"/>
+              </w:rPr>
+              <w:t>RQNF21</w:t>
+            </w:r>
+            <w:r>
+              <w:rPr>
+                <w:rtl w:val="0"/>
+              </w:rPr>
+            </w:r>
+          </w:p>
+        </w:tc>
+        <w:tc>
+          <w:tcPr/>
+          <w:p>
+            <w:pPr>
+              <w:spacing w:line="276" w:lineRule="auto"/>
+              <w:rPr/>
+            </w:pPr>
+            <w:r>
+              <w:rPr>
+                <w:rtl w:val="0"/>
+              </w:rPr>
+              <w:t>Cumple</w:t>
+            </w:r>
+          </w:p>
+        </w:tc>
+        <w:tc>
+          <w:tcPr>
+            <w:gridSpan w:val="2"/>
+          </w:tcPr>
+          <w:p>
+            <w:pPr>
+              <w:spacing w:line="276" w:lineRule="auto"/>
+              <w:rPr/>
+            </w:pPr>
+            <w:r>
+              <w:rPr>
+                <w:rtl w:val="0"/>
+              </w:rPr>
+              <w:t>configs/app.yaml y --set.</w:t>
+            </w:r>
+          </w:p>
+        </w:tc>
+      </w:tr>
+      <w:tr>
+        <w:trPr>
+          <w:cantSplit w:val="0"/>
+          <w:tblHeader w:val="0"/>
+        </w:trPr>
+        <w:tc>
+          <w:tcPr/>
+          <w:p>
+            <w:pPr>
+              <w:spacing w:line="276" w:lineRule="auto"/>
+              <w:rPr/>
+            </w:pPr>
+            <w:r>
+              <w:rPr>
+                <w:b w:val="1"/>
+                <w:bCs w:val="1"/>
+                <w:rtl w:val="0"/>
+              </w:rPr>
+              <w:t>RQNF22</w:t>
+            </w:r>
+            <w:r>
+              <w:rPr>
+                <w:rtl w:val="0"/>
+              </w:rPr>
+            </w:r>
+          </w:p>
+        </w:tc>
+        <w:tc>
+          <w:tcPr/>
+          <w:p>
+            <w:pPr>
+              <w:spacing w:line="276" w:lineRule="auto"/>
+              <w:rPr/>
+            </w:pPr>
+            <w:r>
+              <w:rPr>
+                <w:rtl w:val="0"/>
+              </w:rPr>
+              <w:t>Cumple</w:t>
+            </w:r>
+          </w:p>
+        </w:tc>
+        <w:tc>
+          <w:tcPr>
+            <w:gridSpan w:val="2"/>
+          </w:tcPr>
+          <w:p>
+            <w:pPr>
+              <w:spacing w:line="276" w:lineRule="auto"/>
+              <w:rPr/>
+            </w:pPr>
+            <w:r>
+              <w:rPr>
+                <w:rtl w:val="0"/>
+              </w:rPr>
+              <w:t>Pestaña Video y pruebas automáticas.</w:t>
+            </w:r>
+          </w:p>
+        </w:tc>
+      </w:tr>
+      <w:tr>
+        <w:trPr>
+          <w:cantSplit w:val="0"/>
+          <w:tblHeader w:val="0"/>
+        </w:trPr>
+        <w:tc>
+          <w:tcPr/>
+          <w:p>
+            <w:pPr>
+              <w:spacing w:line="276" w:lineRule="auto"/>
+              <w:rPr/>
+            </w:pPr>
+            <w:r>
+              <w:rPr>
+                <w:b w:val="1"/>
+                <w:bCs w:val="1"/>
+                <w:rtl w:val="0"/>
+              </w:rPr>
+              <w:t>RQNF23</w:t>
+            </w:r>
+            <w:r>
+              <w:rPr>
+                <w:rtl w:val="0"/>
+              </w:rPr>
+            </w:r>
+          </w:p>
+        </w:tc>
+        <w:tc>
+          <w:tcPr/>
+          <w:p>
+            <w:pPr>
+              <w:spacing w:line="276" w:lineRule="auto"/>
+              <w:rPr/>
+            </w:pPr>
+            <w:r>
+              <w:rPr>
+                <w:rtl w:val="0"/>
+              </w:rPr>
+              <w:t>Parcial</w:t>
+            </w:r>
+          </w:p>
+        </w:tc>
+        <w:tc>
+          <w:tcPr>
+            <w:gridSpan w:val="2"/>
+          </w:tcPr>
+          <w:p>
+            <w:pPr>
+              <w:spacing w:line="276" w:lineRule="auto"/>
+              <w:rPr/>
+            </w:pPr>
+            <w:r>
+              <w:rPr>
+                <w:rtl w:val="0"/>
+              </w:rPr>
+              <w:t>Salida del servidor + /api/health; sin archivo de log.</w:t>
+            </w:r>
+          </w:p>
+        </w:tc>
+      </w:tr>
+      <w:tr>
+        <w:trPr>
+          <w:cantSplit w:val="0"/>
+          <w:tblHeader w:val="0"/>
+        </w:trPr>
+        <w:tc>
+          <w:tcPr/>
+          <w:p>
+            <w:pPr>
+              <w:spacing w:line="276" w:lineRule="auto"/>
+              <w:rPr/>
+            </w:pPr>
+            <w:r>
+              <w:rPr>
+                <w:b w:val="1"/>
+                <w:bCs w:val="1"/>
+                <w:rtl w:val="0"/>
+              </w:rPr>
+              <w:t>RQNF24</w:t>
+            </w:r>
+            <w:r>
+              <w:rPr>
+                <w:rtl w:val="0"/>
+              </w:rPr>
+            </w:r>
+          </w:p>
+        </w:tc>
+        <w:tc>
+          <w:tcPr/>
+          <w:p>
+            <w:pPr>
+              <w:spacing w:line="276" w:lineRule="auto"/>
+              <w:rPr/>
+            </w:pPr>
+            <w:r>
+              <w:rPr>
+                <w:rtl w:val="0"/>
+              </w:rPr>
+              <w:t>Parcial</w:t>
+            </w:r>
+          </w:p>
+        </w:tc>
+        <w:tc>
+          <w:tcPr>
+            <w:gridSpan w:val="2"/>
+          </w:tcPr>
+          <w:p>
+            <w:pPr>
+              <w:spacing w:line="276" w:lineRule="auto"/>
+              <w:rPr/>
+            </w:pPr>
+            <w:r>
+              <w:rPr>
+                <w:rtl w:val="0"/>
+              </w:rPr>
+              <w:t>Sin zonas configurables.</w:t>
+            </w:r>
+          </w:p>
+        </w:tc>
+      </w:tr>
+      <w:tr>
+        <w:trPr>
+          <w:cantSplit w:val="0"/>
+          <w:tblHeader w:val="0"/>
+        </w:trPr>
+        <w:tc>
+          <w:tcPr/>
+          <w:p>
+            <w:pPr>
+              <w:spacing w:line="276" w:lineRule="auto"/>
+              <w:rPr/>
+            </w:pPr>
+            <w:r>
+              <w:rPr>
+                <w:b w:val="1"/>
+                <w:bCs w:val="1"/>
+                <w:rtl w:val="0"/>
+              </w:rPr>
+              <w:t>RQNF25</w:t>
+            </w:r>
+            <w:r>
+              <w:rPr>
+                <w:rtl w:val="0"/>
+              </w:rPr>
+            </w:r>
+          </w:p>
+        </w:tc>
+        <w:tc>
+          <w:tcPr/>
+          <w:p>
+            <w:pPr>
+              <w:spacing w:line="276" w:lineRule="auto"/>
+              <w:rPr/>
+            </w:pPr>
+            <w:r>
+              <w:rPr>
+                <w:rtl w:val="0"/>
+              </w:rPr>
+              <w:t>Parcial</w:t>
+            </w:r>
+          </w:p>
+        </w:tc>
+        <w:tc>
+          <w:tcPr>
+            <w:gridSpan w:val="2"/>
+          </w:tcPr>
+          <w:p>
+            <w:pPr>
+              <w:spacing w:line="276" w:lineRule="auto"/>
+              <w:rPr/>
+            </w:pPr>
+            <w:r>
+              <w:rPr>
+                <w:rtl w:val="0"/>
+              </w:rPr>
+              <w:t>Preparado; una cámara en esta versión.</w:t>
+            </w:r>
+          </w:p>
+        </w:tc>
+      </w:tr>
+      <w:tr>
+        <w:trPr>
+          <w:cantSplit w:val="0"/>
+          <w:tblHeader w:val="0"/>
+        </w:trPr>
+        <w:tc>
+          <w:tcPr/>
+          <w:p>
+            <w:pPr>
+              <w:spacing w:line="276" w:lineRule="auto"/>
+              <w:rPr/>
+            </w:pPr>
+            <w:r>
+              <w:rPr>
+                <w:b w:val="1"/>
+                <w:bCs w:val="1"/>
+                <w:rtl w:val="0"/>
+              </w:rPr>
+              <w:t>RQNF26</w:t>
+            </w:r>
+            <w:r>
+              <w:rPr>
+                <w:rtl w:val="0"/>
+              </w:rPr>
+            </w:r>
+          </w:p>
+        </w:tc>
+        <w:tc>
+          <w:tcPr/>
+          <w:p>
+            <w:pPr>
+              <w:spacing w:line="276" w:lineRule="auto"/>
+              <w:rPr/>
+            </w:pPr>
+            <w:r>
+              <w:rPr>
+                <w:rtl w:val="0"/>
+              </w:rPr>
+              <w:t>Parcial</w:t>
+            </w:r>
+          </w:p>
+        </w:tc>
+        <w:tc>
+          <w:tcPr>
+            <w:gridSpan w:val="2"/>
+          </w:tcPr>
+          <w:p>
+            <w:pPr>
+              <w:spacing w:line="276" w:lineRule="auto"/>
+              <w:rPr/>
+            </w:pPr>
+            <w:r>
+              <w:rPr>
+                <w:rtl w:val="0"/>
+              </w:rPr>
+              <w:t>DEGRADADO real; fallo de GPU como error.</w:t>
+            </w:r>
+          </w:p>
+        </w:tc>
+      </w:tr>
+      <w:tr>
+        <w:trPr>
+          <w:cantSplit w:val="0"/>
+          <w:tblHeader w:val="0"/>
+        </w:trPr>
+        <w:tc>
+          <w:tcPr/>
+          <w:p>
+            <w:pPr>
+              <w:spacing w:line="276" w:lineRule="auto"/>
+              <w:rPr/>
+            </w:pPr>
+            <w:r>
+              <w:rPr>
+                <w:b w:val="1"/>
+                <w:bCs w:val="1"/>
+                <w:rtl w:val="0"/>
+              </w:rPr>
+              <w:t>RQNF27</w:t>
+            </w:r>
+            <w:r>
+              <w:rPr>
+                <w:rtl w:val="0"/>
+              </w:rPr>
+            </w:r>
+          </w:p>
+        </w:tc>
+        <w:tc>
+          <w:tcPr/>
+          <w:p>
+            <w:pPr>
+              <w:spacing w:line="276" w:lineRule="auto"/>
+              <w:rPr/>
+            </w:pPr>
+            <w:r>
+              <w:rPr>
+                <w:rtl w:val="0"/>
+              </w:rPr>
+              <w:t>Cumple</w:t>
+            </w:r>
+          </w:p>
+        </w:tc>
+        <w:tc>
+          <w:tcPr>
+            <w:gridSpan w:val="2"/>
+          </w:tcPr>
+          <w:p>
+            <w:pPr>
+              <w:spacing w:line="276" w:lineRule="auto"/>
+              <w:rPr/>
+            </w:pPr>
+            <w:r>
+              <w:rPr>
+                <w:rtl w:val="0"/>
+              </w:rPr>
+              <w:t>Supervisión pasiva.</w:t>
+            </w:r>
+          </w:p>
+        </w:tc>
+      </w:tr>
+    </w:tbl>
     <w:sectPr>
       <w:type w:val="nextPage"/>
       <w:pgSz w:h="16834" w:w="11909" w:orient="portrait"/>

</xml_diff>